<commit_message>
Hogar textil: demo con 1.200 productos (buscador, filtros, Mi pedido) y oferta con catálogo grande
Co-Authored-By: Claude Sonnet 5.5 <noreply@anthropic.com>
Claude-Session: https://claude.ai/code/session_012pES2kzzzwPEYsotem2e5X
</commit_message>
<xml_diff>
--- a/ofertas/hogar-textil/oferta/Oferta-web-textil-hogar.docx
+++ b/ofertas/hogar-textil/oferta/Oferta-web-textil-hogar.docx
@@ -3069,7 +3069,1446 @@
           <w:sz w:val="28"/>
           <w:szCs w:val="28"/>
         </w:rPr>
-        <w:t xml:space="preserve">Cuánto tardamos</w:t>
+        <w:t xml:space="preserve">Tu caso: un catálogo de unos 1.200 productos</w:t>
+      </w:r>
+    </w:p>
+    <w:p>
+      <w:pPr>
+        <w:spacing w:after="100" w:line="290"/>
+      </w:pPr>
+      <w:r>
+        <w:rPr>
+          <w:rFonts w:ascii="Calibri" w:cs="Calibri" w:eastAsia="Calibri" w:hAnsi="Calibri"/>
+          <w:color w:val="1C1A3A"/>
+          <w:sz w:val="21"/>
+          <w:szCs w:val="21"/>
+        </w:rPr>
+        <w:t xml:space="preserve">Con unos 1.200 productos no se carga producto a producto. Trabajamos desde tu hoja de cálculo y publicamos por tandas para que estés vendiendo cuanto antes.</w:t>
+      </w:r>
+    </w:p>
+    <w:p>
+      <w:pPr>
+        <w:keepNext/>
+        <w:spacing w:after="40" w:before="100"/>
+      </w:pPr>
+      <w:r>
+        <w:rPr>
+          <w:rFonts w:ascii="Calibri" w:cs="Calibri" w:eastAsia="Calibri" w:hAnsi="Calibri"/>
+          <w:b/>
+          <w:bCs/>
+          <w:color w:val="6D3AE8"/>
+          <w:sz w:val="21"/>
+          <w:szCs w:val="21"/>
+        </w:rPr>
+        <w:t xml:space="preserve">Carga del catálogo (se suma al paquete)</w:t>
+      </w:r>
+    </w:p>
+    <w:tbl>
+      <w:tblPr>
+        <w:tblW w:type="dxa" w:w="9638"/>
+        <w:tblBorders>
+          <w:top w:val="single" w:color="auto" w:sz="4"/>
+          <w:left w:val="single" w:color="auto" w:sz="4"/>
+          <w:bottom w:val="single" w:color="auto" w:sz="4"/>
+          <w:right w:val="single" w:color="auto" w:sz="4"/>
+          <w:insideH w:val="single" w:color="auto" w:sz="4"/>
+          <w:insideV w:val="single" w:color="auto" w:sz="4"/>
+        </w:tblBorders>
+      </w:tblPr>
+      <w:tblGrid>
+        <w:gridCol w:w="4000"/>
+        <w:gridCol w:w="2800"/>
+        <w:gridCol w:w="2838"/>
+      </w:tblGrid>
+      <w:tr>
+        <w:trPr>
+          <w:tblHeader/>
+        </w:trPr>
+        <w:tc>
+          <w:tcPr>
+            <w:tcW w:type="dxa" w:w="4000"/>
+            <w:tcBorders>
+              <w:top w:val="single" w:color="D9D3EE" w:sz="4"/>
+              <w:left w:val="single" w:color="D9D3EE" w:sz="4"/>
+              <w:bottom w:val="single" w:color="D9D3EE" w:sz="4"/>
+              <w:right w:val="single" w:color="D9D3EE" w:sz="4"/>
+            </w:tcBorders>
+            <w:shd w:fill="F1EDFF" w:color="auto" w:val="clear"/>
+            <w:tcMar>
+              <w:top w:type="dxa" w:w="70"/>
+              <w:left w:type="dxa" w:w="100"/>
+              <w:bottom w:type="dxa" w:w="70"/>
+              <w:right w:type="dxa" w:w="100"/>
+            </w:tcMar>
+            <w:vAlign w:val="center"/>
+          </w:tcPr>
+          <w:p>
+            <w:pPr>
+              <w:jc w:val="left"/>
+            </w:pPr>
+            <w:r>
+              <w:rPr>
+                <w:rFonts w:ascii="Calibri" w:cs="Calibri" w:eastAsia="Calibri" w:hAnsi="Calibri"/>
+                <w:b/>
+                <w:bCs/>
+                <w:color w:val="6D3AE8"/>
+                <w:sz w:val="19"/>
+                <w:szCs w:val="19"/>
+              </w:rPr>
+              <w:t xml:space="preserve">Tamaño del catálogo</w:t>
+            </w:r>
+          </w:p>
+        </w:tc>
+        <w:tc>
+          <w:tcPr>
+            <w:tcW w:type="dxa" w:w="2800"/>
+            <w:tcBorders>
+              <w:top w:val="single" w:color="D9D3EE" w:sz="4"/>
+              <w:left w:val="single" w:color="D9D3EE" w:sz="4"/>
+              <w:bottom w:val="single" w:color="D9D3EE" w:sz="4"/>
+              <w:right w:val="single" w:color="D9D3EE" w:sz="4"/>
+            </w:tcBorders>
+            <w:shd w:fill="F1EDFF" w:color="auto" w:val="clear"/>
+            <w:tcMar>
+              <w:top w:type="dxa" w:w="70"/>
+              <w:left w:type="dxa" w:w="100"/>
+              <w:bottom w:type="dxa" w:w="70"/>
+              <w:right w:type="dxa" w:w="100"/>
+            </w:tcMar>
+            <w:vAlign w:val="center"/>
+          </w:tcPr>
+          <w:p>
+            <w:pPr>
+              <w:jc w:val="center"/>
+            </w:pPr>
+            <w:r>
+              <w:rPr>
+                <w:rFonts w:ascii="Calibri" w:cs="Calibri" w:eastAsia="Calibri" w:hAnsi="Calibri"/>
+                <w:b/>
+                <w:bCs/>
+                <w:color w:val="6D3AE8"/>
+                <w:sz w:val="19"/>
+                <w:szCs w:val="19"/>
+              </w:rPr>
+              <w:t xml:space="preserve">Pago único</w:t>
+            </w:r>
+          </w:p>
+        </w:tc>
+        <w:tc>
+          <w:tcPr>
+            <w:tcW w:type="dxa" w:w="2838"/>
+            <w:tcBorders>
+              <w:top w:val="single" w:color="D9D3EE" w:sz="4"/>
+              <w:left w:val="single" w:color="D9D3EE" w:sz="4"/>
+              <w:bottom w:val="single" w:color="D9D3EE" w:sz="4"/>
+              <w:right w:val="single" w:color="D9D3EE" w:sz="4"/>
+            </w:tcBorders>
+            <w:shd w:fill="F1EDFF" w:color="auto" w:val="clear"/>
+            <w:tcMar>
+              <w:top w:type="dxa" w:w="70"/>
+              <w:left w:type="dxa" w:w="100"/>
+              <w:bottom w:type="dxa" w:w="70"/>
+              <w:right w:type="dxa" w:w="100"/>
+            </w:tcMar>
+            <w:vAlign w:val="center"/>
+          </w:tcPr>
+          <w:p>
+            <w:pPr>
+              <w:jc w:val="center"/>
+            </w:pPr>
+            <w:r>
+              <w:rPr>
+                <w:rFonts w:ascii="Calibri" w:cs="Calibri" w:eastAsia="Calibri" w:hAnsi="Calibri"/>
+                <w:b/>
+                <w:bCs/>
+                <w:color w:val="6D3AE8"/>
+                <w:sz w:val="19"/>
+                <w:szCs w:val="19"/>
+              </w:rPr>
+              <w:t xml:space="preserve">Cuota mensual</w:t>
+            </w:r>
+          </w:p>
+        </w:tc>
+      </w:tr>
+      <w:tr>
+        <w:trPr>
+          <w:cantSplit/>
+        </w:trPr>
+        <w:tc>
+          <w:tcPr>
+            <w:tcW w:type="dxa" w:w="4000"/>
+            <w:tcBorders>
+              <w:top w:val="single" w:color="D9D3EE" w:sz="4"/>
+              <w:left w:val="single" w:color="D9D3EE" w:sz="4"/>
+              <w:bottom w:val="single" w:color="D9D3EE" w:sz="4"/>
+              <w:right w:val="single" w:color="D9D3EE" w:sz="4"/>
+            </w:tcBorders>
+            <w:tcMar>
+              <w:top w:type="dxa" w:w="70"/>
+              <w:left w:type="dxa" w:w="100"/>
+              <w:bottom w:type="dxa" w:w="70"/>
+              <w:right w:type="dxa" w:w="100"/>
+            </w:tcMar>
+            <w:vAlign w:val="center"/>
+          </w:tcPr>
+          <w:p>
+            <w:pPr>
+              <w:jc w:val="left"/>
+            </w:pPr>
+            <w:r>
+              <w:rPr>
+                <w:rFonts w:ascii="Calibri" w:cs="Calibri" w:eastAsia="Calibri" w:hAnsi="Calibri"/>
+                <w:color w:val="1C1A3A"/>
+                <w:sz w:val="19"/>
+                <w:szCs w:val="19"/>
+              </w:rPr>
+              <w:t xml:space="preserve">Hasta 100 productos</w:t>
+            </w:r>
+          </w:p>
+        </w:tc>
+        <w:tc>
+          <w:tcPr>
+            <w:tcW w:type="dxa" w:w="2800"/>
+            <w:tcBorders>
+              <w:top w:val="single" w:color="D9D3EE" w:sz="4"/>
+              <w:left w:val="single" w:color="D9D3EE" w:sz="4"/>
+              <w:bottom w:val="single" w:color="D9D3EE" w:sz="4"/>
+              <w:right w:val="single" w:color="D9D3EE" w:sz="4"/>
+            </w:tcBorders>
+            <w:tcMar>
+              <w:top w:type="dxa" w:w="70"/>
+              <w:left w:type="dxa" w:w="100"/>
+              <w:bottom w:type="dxa" w:w="70"/>
+              <w:right w:type="dxa" w:w="100"/>
+            </w:tcMar>
+            <w:vAlign w:val="center"/>
+          </w:tcPr>
+          <w:p>
+            <w:pPr>
+              <w:jc w:val="center"/>
+            </w:pPr>
+            <w:r>
+              <w:rPr>
+                <w:rFonts w:ascii="Calibri" w:cs="Calibri" w:eastAsia="Calibri" w:hAnsi="Calibri"/>
+                <w:color w:val="1C1A3A"/>
+                <w:sz w:val="19"/>
+                <w:szCs w:val="19"/>
+              </w:rPr>
+              <w:t xml:space="preserve">+120 €</w:t>
+            </w:r>
+          </w:p>
+        </w:tc>
+        <w:tc>
+          <w:tcPr>
+            <w:tcW w:type="dxa" w:w="2838"/>
+            <w:tcBorders>
+              <w:top w:val="single" w:color="D9D3EE" w:sz="4"/>
+              <w:left w:val="single" w:color="D9D3EE" w:sz="4"/>
+              <w:bottom w:val="single" w:color="D9D3EE" w:sz="4"/>
+              <w:right w:val="single" w:color="D9D3EE" w:sz="4"/>
+            </w:tcBorders>
+            <w:tcMar>
+              <w:top w:type="dxa" w:w="70"/>
+              <w:left w:type="dxa" w:w="100"/>
+              <w:bottom w:type="dxa" w:w="70"/>
+              <w:right w:type="dxa" w:w="100"/>
+            </w:tcMar>
+            <w:vAlign w:val="center"/>
+          </w:tcPr>
+          <w:p>
+            <w:pPr>
+              <w:jc w:val="center"/>
+            </w:pPr>
+            <w:r>
+              <w:rPr>
+                <w:rFonts w:ascii="Calibri" w:cs="Calibri" w:eastAsia="Calibri" w:hAnsi="Calibri"/>
+                <w:color w:val="1C1A3A"/>
+                <w:sz w:val="19"/>
+                <w:szCs w:val="19"/>
+              </w:rPr>
+              <w:t xml:space="preserve">Sin cambio</w:t>
+            </w:r>
+          </w:p>
+        </w:tc>
+      </w:tr>
+      <w:tr>
+        <w:trPr>
+          <w:cantSplit/>
+        </w:trPr>
+        <w:tc>
+          <w:tcPr>
+            <w:tcW w:type="dxa" w:w="4000"/>
+            <w:tcBorders>
+              <w:top w:val="single" w:color="D9D3EE" w:sz="4"/>
+              <w:left w:val="single" w:color="D9D3EE" w:sz="4"/>
+              <w:bottom w:val="single" w:color="D9D3EE" w:sz="4"/>
+              <w:right w:val="single" w:color="D9D3EE" w:sz="4"/>
+            </w:tcBorders>
+            <w:tcMar>
+              <w:top w:type="dxa" w:w="70"/>
+              <w:left w:type="dxa" w:w="100"/>
+              <w:bottom w:type="dxa" w:w="70"/>
+              <w:right w:type="dxa" w:w="100"/>
+            </w:tcMar>
+            <w:vAlign w:val="center"/>
+          </w:tcPr>
+          <w:p>
+            <w:pPr>
+              <w:jc w:val="left"/>
+            </w:pPr>
+            <w:r>
+              <w:rPr>
+                <w:rFonts w:ascii="Calibri" w:cs="Calibri" w:eastAsia="Calibri" w:hAnsi="Calibri"/>
+                <w:color w:val="1C1A3A"/>
+                <w:sz w:val="19"/>
+                <w:szCs w:val="19"/>
+              </w:rPr>
+              <w:t xml:space="preserve">Hasta 300 productos</w:t>
+            </w:r>
+          </w:p>
+        </w:tc>
+        <w:tc>
+          <w:tcPr>
+            <w:tcW w:type="dxa" w:w="2800"/>
+            <w:tcBorders>
+              <w:top w:val="single" w:color="D9D3EE" w:sz="4"/>
+              <w:left w:val="single" w:color="D9D3EE" w:sz="4"/>
+              <w:bottom w:val="single" w:color="D9D3EE" w:sz="4"/>
+              <w:right w:val="single" w:color="D9D3EE" w:sz="4"/>
+            </w:tcBorders>
+            <w:tcMar>
+              <w:top w:type="dxa" w:w="70"/>
+              <w:left w:type="dxa" w:w="100"/>
+              <w:bottom w:type="dxa" w:w="70"/>
+              <w:right w:type="dxa" w:w="100"/>
+            </w:tcMar>
+            <w:vAlign w:val="center"/>
+          </w:tcPr>
+          <w:p>
+            <w:pPr>
+              <w:jc w:val="center"/>
+            </w:pPr>
+            <w:r>
+              <w:rPr>
+                <w:rFonts w:ascii="Calibri" w:cs="Calibri" w:eastAsia="Calibri" w:hAnsi="Calibri"/>
+                <w:color w:val="1C1A3A"/>
+                <w:sz w:val="19"/>
+                <w:szCs w:val="19"/>
+              </w:rPr>
+              <w:t xml:space="preserve">+250 €</w:t>
+            </w:r>
+          </w:p>
+        </w:tc>
+        <w:tc>
+          <w:tcPr>
+            <w:tcW w:type="dxa" w:w="2838"/>
+            <w:tcBorders>
+              <w:top w:val="single" w:color="D9D3EE" w:sz="4"/>
+              <w:left w:val="single" w:color="D9D3EE" w:sz="4"/>
+              <w:bottom w:val="single" w:color="D9D3EE" w:sz="4"/>
+              <w:right w:val="single" w:color="D9D3EE" w:sz="4"/>
+            </w:tcBorders>
+            <w:tcMar>
+              <w:top w:type="dxa" w:w="70"/>
+              <w:left w:type="dxa" w:w="100"/>
+              <w:bottom w:type="dxa" w:w="70"/>
+              <w:right w:type="dxa" w:w="100"/>
+            </w:tcMar>
+            <w:vAlign w:val="center"/>
+          </w:tcPr>
+          <w:p>
+            <w:pPr>
+              <w:jc w:val="center"/>
+            </w:pPr>
+            <w:r>
+              <w:rPr>
+                <w:rFonts w:ascii="Calibri" w:cs="Calibri" w:eastAsia="Calibri" w:hAnsi="Calibri"/>
+                <w:color w:val="1C1A3A"/>
+                <w:sz w:val="19"/>
+                <w:szCs w:val="19"/>
+              </w:rPr>
+              <w:t xml:space="preserve">Sin cambio</w:t>
+            </w:r>
+          </w:p>
+        </w:tc>
+      </w:tr>
+      <w:tr>
+        <w:trPr>
+          <w:cantSplit/>
+        </w:trPr>
+        <w:tc>
+          <w:tcPr>
+            <w:tcW w:type="dxa" w:w="4000"/>
+            <w:tcBorders>
+              <w:top w:val="single" w:color="D9D3EE" w:sz="4"/>
+              <w:left w:val="single" w:color="D9D3EE" w:sz="4"/>
+              <w:bottom w:val="single" w:color="D9D3EE" w:sz="4"/>
+              <w:right w:val="single" w:color="D9D3EE" w:sz="4"/>
+            </w:tcBorders>
+            <w:tcMar>
+              <w:top w:type="dxa" w:w="70"/>
+              <w:left w:type="dxa" w:w="100"/>
+              <w:bottom w:type="dxa" w:w="70"/>
+              <w:right w:type="dxa" w:w="100"/>
+            </w:tcMar>
+            <w:vAlign w:val="center"/>
+          </w:tcPr>
+          <w:p>
+            <w:pPr>
+              <w:jc w:val="left"/>
+            </w:pPr>
+            <w:r>
+              <w:rPr>
+                <w:rFonts w:ascii="Calibri" w:cs="Calibri" w:eastAsia="Calibri" w:hAnsi="Calibri"/>
+                <w:color w:val="1C1A3A"/>
+                <w:sz w:val="19"/>
+                <w:szCs w:val="19"/>
+              </w:rPr>
+              <w:t xml:space="preserve">Hasta 600 productos</w:t>
+            </w:r>
+          </w:p>
+        </w:tc>
+        <w:tc>
+          <w:tcPr>
+            <w:tcW w:type="dxa" w:w="2800"/>
+            <w:tcBorders>
+              <w:top w:val="single" w:color="D9D3EE" w:sz="4"/>
+              <w:left w:val="single" w:color="D9D3EE" w:sz="4"/>
+              <w:bottom w:val="single" w:color="D9D3EE" w:sz="4"/>
+              <w:right w:val="single" w:color="D9D3EE" w:sz="4"/>
+            </w:tcBorders>
+            <w:tcMar>
+              <w:top w:type="dxa" w:w="70"/>
+              <w:left w:type="dxa" w:w="100"/>
+              <w:bottom w:type="dxa" w:w="70"/>
+              <w:right w:type="dxa" w:w="100"/>
+            </w:tcMar>
+            <w:vAlign w:val="center"/>
+          </w:tcPr>
+          <w:p>
+            <w:pPr>
+              <w:jc w:val="center"/>
+            </w:pPr>
+            <w:r>
+              <w:rPr>
+                <w:rFonts w:ascii="Calibri" w:cs="Calibri" w:eastAsia="Calibri" w:hAnsi="Calibri"/>
+                <w:color w:val="1C1A3A"/>
+                <w:sz w:val="19"/>
+                <w:szCs w:val="19"/>
+              </w:rPr>
+              <w:t xml:space="preserve">+420 €</w:t>
+            </w:r>
+          </w:p>
+        </w:tc>
+        <w:tc>
+          <w:tcPr>
+            <w:tcW w:type="dxa" w:w="2838"/>
+            <w:tcBorders>
+              <w:top w:val="single" w:color="D9D3EE" w:sz="4"/>
+              <w:left w:val="single" w:color="D9D3EE" w:sz="4"/>
+              <w:bottom w:val="single" w:color="D9D3EE" w:sz="4"/>
+              <w:right w:val="single" w:color="D9D3EE" w:sz="4"/>
+            </w:tcBorders>
+            <w:tcMar>
+              <w:top w:type="dxa" w:w="70"/>
+              <w:left w:type="dxa" w:w="100"/>
+              <w:bottom w:type="dxa" w:w="70"/>
+              <w:right w:type="dxa" w:w="100"/>
+            </w:tcMar>
+            <w:vAlign w:val="center"/>
+          </w:tcPr>
+          <w:p>
+            <w:pPr>
+              <w:jc w:val="center"/>
+            </w:pPr>
+            <w:r>
+              <w:rPr>
+                <w:rFonts w:ascii="Calibri" w:cs="Calibri" w:eastAsia="Calibri" w:hAnsi="Calibri"/>
+                <w:color w:val="1C1A3A"/>
+                <w:sz w:val="19"/>
+                <w:szCs w:val="19"/>
+              </w:rPr>
+              <w:t xml:space="preserve">+15 €/mes</w:t>
+            </w:r>
+          </w:p>
+        </w:tc>
+      </w:tr>
+      <w:tr>
+        <w:trPr>
+          <w:cantSplit/>
+        </w:trPr>
+        <w:tc>
+          <w:tcPr>
+            <w:tcW w:type="dxa" w:w="4000"/>
+            <w:tcBorders>
+              <w:top w:val="single" w:color="D9D3EE" w:sz="4"/>
+              <w:left w:val="single" w:color="D9D3EE" w:sz="4"/>
+              <w:bottom w:val="single" w:color="D9D3EE" w:sz="4"/>
+              <w:right w:val="single" w:color="D9D3EE" w:sz="4"/>
+            </w:tcBorders>
+            <w:tcMar>
+              <w:top w:type="dxa" w:w="70"/>
+              <w:left w:type="dxa" w:w="100"/>
+              <w:bottom w:type="dxa" w:w="70"/>
+              <w:right w:type="dxa" w:w="100"/>
+            </w:tcMar>
+            <w:vAlign w:val="center"/>
+          </w:tcPr>
+          <w:p>
+            <w:pPr>
+              <w:jc w:val="left"/>
+            </w:pPr>
+            <w:r>
+              <w:rPr>
+                <w:rFonts w:ascii="Calibri" w:cs="Calibri" w:eastAsia="Calibri" w:hAnsi="Calibri"/>
+                <w:color w:val="1C1A3A"/>
+                <w:sz w:val="19"/>
+                <w:szCs w:val="19"/>
+              </w:rPr>
+              <w:t xml:space="preserve">Hasta 1.200 productos</w:t>
+            </w:r>
+          </w:p>
+        </w:tc>
+        <w:tc>
+          <w:tcPr>
+            <w:tcW w:type="dxa" w:w="2800"/>
+            <w:tcBorders>
+              <w:top w:val="single" w:color="D9D3EE" w:sz="4"/>
+              <w:left w:val="single" w:color="D9D3EE" w:sz="4"/>
+              <w:bottom w:val="single" w:color="D9D3EE" w:sz="4"/>
+              <w:right w:val="single" w:color="D9D3EE" w:sz="4"/>
+            </w:tcBorders>
+            <w:tcMar>
+              <w:top w:type="dxa" w:w="70"/>
+              <w:left w:type="dxa" w:w="100"/>
+              <w:bottom w:type="dxa" w:w="70"/>
+              <w:right w:type="dxa" w:w="100"/>
+            </w:tcMar>
+            <w:vAlign w:val="center"/>
+          </w:tcPr>
+          <w:p>
+            <w:pPr>
+              <w:jc w:val="center"/>
+            </w:pPr>
+            <w:r>
+              <w:rPr>
+                <w:rFonts w:ascii="Calibri" w:cs="Calibri" w:eastAsia="Calibri" w:hAnsi="Calibri"/>
+                <w:color w:val="1C1A3A"/>
+                <w:sz w:val="19"/>
+                <w:szCs w:val="19"/>
+              </w:rPr>
+              <w:t xml:space="preserve">+700 €</w:t>
+            </w:r>
+          </w:p>
+        </w:tc>
+        <w:tc>
+          <w:tcPr>
+            <w:tcW w:type="dxa" w:w="2838"/>
+            <w:tcBorders>
+              <w:top w:val="single" w:color="D9D3EE" w:sz="4"/>
+              <w:left w:val="single" w:color="D9D3EE" w:sz="4"/>
+              <w:bottom w:val="single" w:color="D9D3EE" w:sz="4"/>
+              <w:right w:val="single" w:color="D9D3EE" w:sz="4"/>
+            </w:tcBorders>
+            <w:tcMar>
+              <w:top w:type="dxa" w:w="70"/>
+              <w:left w:type="dxa" w:w="100"/>
+              <w:bottom w:type="dxa" w:w="70"/>
+              <w:right w:type="dxa" w:w="100"/>
+            </w:tcMar>
+            <w:vAlign w:val="center"/>
+          </w:tcPr>
+          <w:p>
+            <w:pPr>
+              <w:jc w:val="center"/>
+            </w:pPr>
+            <w:r>
+              <w:rPr>
+                <w:rFonts w:ascii="Calibri" w:cs="Calibri" w:eastAsia="Calibri" w:hAnsi="Calibri"/>
+                <w:color w:val="1C1A3A"/>
+                <w:sz w:val="19"/>
+                <w:szCs w:val="19"/>
+              </w:rPr>
+              <w:t xml:space="preserve">+15 €/mes</w:t>
+            </w:r>
+          </w:p>
+        </w:tc>
+      </w:tr>
+    </w:tbl>
+    <w:p>
+      <w:pPr>
+        <w:keepNext/>
+        <w:spacing w:after="40" w:before="160"/>
+      </w:pPr>
+      <w:r>
+        <w:rPr>
+          <w:rFonts w:ascii="Calibri" w:cs="Calibri" w:eastAsia="Calibri" w:hAnsi="Calibri"/>
+          <w:b/>
+          <w:bCs/>
+          <w:color w:val="6D3AE8"/>
+          <w:sz w:val="21"/>
+          <w:szCs w:val="21"/>
+        </w:rPr>
+        <w:t xml:space="preserve">Tu caso con 1.200 productos</w:t>
+      </w:r>
+    </w:p>
+    <w:tbl>
+      <w:tblPr>
+        <w:tblW w:type="dxa" w:w="9638"/>
+        <w:tblBorders>
+          <w:top w:val="single" w:color="auto" w:sz="4"/>
+          <w:left w:val="single" w:color="auto" w:sz="4"/>
+          <w:bottom w:val="single" w:color="auto" w:sz="4"/>
+          <w:right w:val="single" w:color="auto" w:sz="4"/>
+          <w:insideH w:val="single" w:color="auto" w:sz="4"/>
+          <w:insideV w:val="single" w:color="auto" w:sz="4"/>
+        </w:tblBorders>
+      </w:tblPr>
+      <w:tblGrid>
+        <w:gridCol w:w="2800"/>
+        <w:gridCol w:w="3100"/>
+        <w:gridCol w:w="1500"/>
+        <w:gridCol w:w="2238"/>
+      </w:tblGrid>
+      <w:tr>
+        <w:trPr>
+          <w:tblHeader/>
+        </w:trPr>
+        <w:tc>
+          <w:tcPr>
+            <w:tcW w:type="dxa" w:w="2800"/>
+            <w:tcBorders>
+              <w:top w:val="single" w:color="D9D3EE" w:sz="4"/>
+              <w:left w:val="single" w:color="D9D3EE" w:sz="4"/>
+              <w:bottom w:val="single" w:color="D9D3EE" w:sz="4"/>
+              <w:right w:val="single" w:color="D9D3EE" w:sz="4"/>
+            </w:tcBorders>
+            <w:shd w:fill="F1EDFF" w:color="auto" w:val="clear"/>
+            <w:tcMar>
+              <w:top w:type="dxa" w:w="70"/>
+              <w:left w:type="dxa" w:w="100"/>
+              <w:bottom w:type="dxa" w:w="70"/>
+              <w:right w:type="dxa" w:w="100"/>
+            </w:tcMar>
+            <w:vAlign w:val="center"/>
+          </w:tcPr>
+          <w:p>
+            <w:pPr>
+              <w:jc w:val="left"/>
+            </w:pPr>
+            <w:r>
+              <w:rPr>
+                <w:rFonts w:ascii="Calibri" w:cs="Calibri" w:eastAsia="Calibri" w:hAnsi="Calibri"/>
+                <w:b/>
+                <w:bCs/>
+                <w:color w:val="6D3AE8"/>
+                <w:sz w:val="19"/>
+                <w:szCs w:val="19"/>
+              </w:rPr>
+              <w:t xml:space="preserve">Paquete</w:t>
+            </w:r>
+          </w:p>
+        </w:tc>
+        <w:tc>
+          <w:tcPr>
+            <w:tcW w:type="dxa" w:w="3100"/>
+            <w:tcBorders>
+              <w:top w:val="single" w:color="D9D3EE" w:sz="4"/>
+              <w:left w:val="single" w:color="D9D3EE" w:sz="4"/>
+              <w:bottom w:val="single" w:color="D9D3EE" w:sz="4"/>
+              <w:right w:val="single" w:color="D9D3EE" w:sz="4"/>
+            </w:tcBorders>
+            <w:shd w:fill="F1EDFF" w:color="auto" w:val="clear"/>
+            <w:tcMar>
+              <w:top w:type="dxa" w:w="70"/>
+              <w:left w:type="dxa" w:w="100"/>
+              <w:bottom w:type="dxa" w:w="70"/>
+              <w:right w:type="dxa" w:w="100"/>
+            </w:tcMar>
+            <w:vAlign w:val="center"/>
+          </w:tcPr>
+          <w:p>
+            <w:pPr>
+              <w:jc w:val="center"/>
+            </w:pPr>
+            <w:r>
+              <w:rPr>
+                <w:rFonts w:ascii="Calibri" w:cs="Calibri" w:eastAsia="Calibri" w:hAnsi="Calibri"/>
+                <w:b/>
+                <w:bCs/>
+                <w:color w:val="6D3AE8"/>
+                <w:sz w:val="19"/>
+                <w:szCs w:val="19"/>
+              </w:rPr>
+              <w:t xml:space="preserve">Pago único</w:t>
+            </w:r>
+          </w:p>
+        </w:tc>
+        <w:tc>
+          <w:tcPr>
+            <w:tcW w:type="dxa" w:w="1500"/>
+            <w:tcBorders>
+              <w:top w:val="single" w:color="D9D3EE" w:sz="4"/>
+              <w:left w:val="single" w:color="D9D3EE" w:sz="4"/>
+              <w:bottom w:val="single" w:color="D9D3EE" w:sz="4"/>
+              <w:right w:val="single" w:color="D9D3EE" w:sz="4"/>
+            </w:tcBorders>
+            <w:shd w:fill="F1EDFF" w:color="auto" w:val="clear"/>
+            <w:tcMar>
+              <w:top w:type="dxa" w:w="70"/>
+              <w:left w:type="dxa" w:w="100"/>
+              <w:bottom w:type="dxa" w:w="70"/>
+              <w:right w:type="dxa" w:w="100"/>
+            </w:tcMar>
+            <w:vAlign w:val="center"/>
+          </w:tcPr>
+          <w:p>
+            <w:pPr>
+              <w:jc w:val="center"/>
+            </w:pPr>
+            <w:r>
+              <w:rPr>
+                <w:rFonts w:ascii="Calibri" w:cs="Calibri" w:eastAsia="Calibri" w:hAnsi="Calibri"/>
+                <w:b/>
+                <w:bCs/>
+                <w:color w:val="6D3AE8"/>
+                <w:sz w:val="19"/>
+                <w:szCs w:val="19"/>
+              </w:rPr>
+              <w:t xml:space="preserve">Cuota</w:t>
+            </w:r>
+          </w:p>
+        </w:tc>
+        <w:tc>
+          <w:tcPr>
+            <w:tcW w:type="dxa" w:w="2238"/>
+            <w:tcBorders>
+              <w:top w:val="single" w:color="D9D3EE" w:sz="4"/>
+              <w:left w:val="single" w:color="D9D3EE" w:sz="4"/>
+              <w:bottom w:val="single" w:color="D9D3EE" w:sz="4"/>
+              <w:right w:val="single" w:color="D9D3EE" w:sz="4"/>
+            </w:tcBorders>
+            <w:shd w:fill="F1EDFF" w:color="auto" w:val="clear"/>
+            <w:tcMar>
+              <w:top w:type="dxa" w:w="70"/>
+              <w:left w:type="dxa" w:w="100"/>
+              <w:bottom w:type="dxa" w:w="70"/>
+              <w:right w:type="dxa" w:w="100"/>
+            </w:tcMar>
+            <w:vAlign w:val="center"/>
+          </w:tcPr>
+          <w:p>
+            <w:pPr>
+              <w:jc w:val="center"/>
+            </w:pPr>
+            <w:r>
+              <w:rPr>
+                <w:rFonts w:ascii="Calibri" w:cs="Calibri" w:eastAsia="Calibri" w:hAnsi="Calibri"/>
+                <w:b/>
+                <w:bCs/>
+                <w:color w:val="6D3AE8"/>
+                <w:sz w:val="19"/>
+                <w:szCs w:val="19"/>
+              </w:rPr>
+              <w:t xml:space="preserve">Plazo</w:t>
+            </w:r>
+          </w:p>
+        </w:tc>
+      </w:tr>
+      <w:tr>
+        <w:trPr>
+          <w:cantSplit/>
+        </w:trPr>
+        <w:tc>
+          <w:tcPr>
+            <w:tcW w:type="dxa" w:w="2800"/>
+            <w:tcBorders>
+              <w:top w:val="single" w:color="D9D3EE" w:sz="4"/>
+              <w:left w:val="single" w:color="D9D3EE" w:sz="4"/>
+              <w:bottom w:val="single" w:color="D9D3EE" w:sz="4"/>
+              <w:right w:val="single" w:color="D9D3EE" w:sz="4"/>
+            </w:tcBorders>
+            <w:tcMar>
+              <w:top w:type="dxa" w:w="70"/>
+              <w:left w:type="dxa" w:w="100"/>
+              <w:bottom w:type="dxa" w:w="70"/>
+              <w:right w:type="dxa" w:w="100"/>
+            </w:tcMar>
+            <w:vAlign w:val="center"/>
+          </w:tcPr>
+          <w:p>
+            <w:pPr>
+              <w:jc w:val="left"/>
+            </w:pPr>
+            <w:r>
+              <w:rPr>
+                <w:rFonts w:ascii="Calibri" w:cs="Calibri" w:eastAsia="Calibri" w:hAnsi="Calibri"/>
+                <w:b/>
+                <w:bCs/>
+                <w:color w:val="1C1A3A"/>
+                <w:sz w:val="19"/>
+                <w:szCs w:val="19"/>
+              </w:rPr>
+              <w:t xml:space="preserve">A · Catálogo + WhatsApp</w:t>
+            </w:r>
+          </w:p>
+        </w:tc>
+        <w:tc>
+          <w:tcPr>
+            <w:tcW w:type="dxa" w:w="3100"/>
+            <w:tcBorders>
+              <w:top w:val="single" w:color="D9D3EE" w:sz="4"/>
+              <w:left w:val="single" w:color="D9D3EE" w:sz="4"/>
+              <w:bottom w:val="single" w:color="D9D3EE" w:sz="4"/>
+              <w:right w:val="single" w:color="D9D3EE" w:sz="4"/>
+            </w:tcBorders>
+            <w:tcMar>
+              <w:top w:type="dxa" w:w="70"/>
+              <w:left w:type="dxa" w:w="100"/>
+              <w:bottom w:type="dxa" w:w="70"/>
+              <w:right w:type="dxa" w:w="100"/>
+            </w:tcMar>
+            <w:vAlign w:val="center"/>
+          </w:tcPr>
+          <w:p>
+            <w:pPr>
+              <w:jc w:val="center"/>
+            </w:pPr>
+            <w:r>
+              <w:rPr>
+                <w:rFonts w:ascii="Calibri" w:cs="Calibri" w:eastAsia="Calibri" w:hAnsi="Calibri"/>
+                <w:b/>
+                <w:bCs/>
+                <w:color w:val="1C1A3A"/>
+                <w:sz w:val="19"/>
+                <w:szCs w:val="19"/>
+              </w:rPr>
+              <w:t xml:space="preserve">295 € + 700 € = 995 €</w:t>
+            </w:r>
+          </w:p>
+        </w:tc>
+        <w:tc>
+          <w:tcPr>
+            <w:tcW w:type="dxa" w:w="1500"/>
+            <w:tcBorders>
+              <w:top w:val="single" w:color="D9D3EE" w:sz="4"/>
+              <w:left w:val="single" w:color="D9D3EE" w:sz="4"/>
+              <w:bottom w:val="single" w:color="D9D3EE" w:sz="4"/>
+              <w:right w:val="single" w:color="D9D3EE" w:sz="4"/>
+            </w:tcBorders>
+            <w:tcMar>
+              <w:top w:type="dxa" w:w="70"/>
+              <w:left w:type="dxa" w:w="100"/>
+              <w:bottom w:type="dxa" w:w="70"/>
+              <w:right w:type="dxa" w:w="100"/>
+            </w:tcMar>
+            <w:vAlign w:val="center"/>
+          </w:tcPr>
+          <w:p>
+            <w:pPr>
+              <w:jc w:val="center"/>
+            </w:pPr>
+            <w:r>
+              <w:rPr>
+                <w:rFonts w:ascii="Calibri" w:cs="Calibri" w:eastAsia="Calibri" w:hAnsi="Calibri"/>
+                <w:color w:val="1C1A3A"/>
+                <w:sz w:val="19"/>
+                <w:szCs w:val="19"/>
+              </w:rPr>
+              <w:t xml:space="preserve">40 €/mes</w:t>
+            </w:r>
+          </w:p>
+        </w:tc>
+        <w:tc>
+          <w:tcPr>
+            <w:tcW w:type="dxa" w:w="2238"/>
+            <w:tcBorders>
+              <w:top w:val="single" w:color="D9D3EE" w:sz="4"/>
+              <w:left w:val="single" w:color="D9D3EE" w:sz="4"/>
+              <w:bottom w:val="single" w:color="D9D3EE" w:sz="4"/>
+              <w:right w:val="single" w:color="D9D3EE" w:sz="4"/>
+            </w:tcBorders>
+            <w:tcMar>
+              <w:top w:type="dxa" w:w="70"/>
+              <w:left w:type="dxa" w:w="100"/>
+              <w:bottom w:type="dxa" w:w="70"/>
+              <w:right w:type="dxa" w:w="100"/>
+            </w:tcMar>
+            <w:vAlign w:val="center"/>
+          </w:tcPr>
+          <w:p>
+            <w:pPr>
+              <w:jc w:val="center"/>
+            </w:pPr>
+            <w:r>
+              <w:rPr>
+                <w:rFonts w:ascii="Calibri" w:cs="Calibri" w:eastAsia="Calibri" w:hAnsi="Calibri"/>
+                <w:b/>
+                <w:bCs/>
+                <w:color w:val="6D3AE8"/>
+                <w:sz w:val="19"/>
+                <w:szCs w:val="19"/>
+              </w:rPr>
+              <w:t xml:space="preserve">12 a 18 días hábiles</w:t>
+            </w:r>
+          </w:p>
+        </w:tc>
+      </w:tr>
+      <w:tr>
+        <w:trPr>
+          <w:cantSplit/>
+        </w:trPr>
+        <w:tc>
+          <w:tcPr>
+            <w:tcW w:type="dxa" w:w="2800"/>
+            <w:tcBorders>
+              <w:top w:val="single" w:color="D9D3EE" w:sz="4"/>
+              <w:left w:val="single" w:color="D9D3EE" w:sz="4"/>
+              <w:bottom w:val="single" w:color="D9D3EE" w:sz="4"/>
+              <w:right w:val="single" w:color="D9D3EE" w:sz="4"/>
+            </w:tcBorders>
+            <w:tcMar>
+              <w:top w:type="dxa" w:w="70"/>
+              <w:left w:type="dxa" w:w="100"/>
+              <w:bottom w:type="dxa" w:w="70"/>
+              <w:right w:type="dxa" w:w="100"/>
+            </w:tcMar>
+            <w:vAlign w:val="center"/>
+          </w:tcPr>
+          <w:p>
+            <w:pPr>
+              <w:jc w:val="left"/>
+            </w:pPr>
+            <w:r>
+              <w:rPr>
+                <w:rFonts w:ascii="Calibri" w:cs="Calibri" w:eastAsia="Calibri" w:hAnsi="Calibri"/>
+                <w:b/>
+                <w:bCs/>
+                <w:color w:val="1C1A3A"/>
+                <w:sz w:val="19"/>
+                <w:szCs w:val="19"/>
+              </w:rPr>
+              <w:t xml:space="preserve">C · Tienda online propia</w:t>
+            </w:r>
+          </w:p>
+        </w:tc>
+        <w:tc>
+          <w:tcPr>
+            <w:tcW w:type="dxa" w:w="3100"/>
+            <w:tcBorders>
+              <w:top w:val="single" w:color="D9D3EE" w:sz="4"/>
+              <w:left w:val="single" w:color="D9D3EE" w:sz="4"/>
+              <w:bottom w:val="single" w:color="D9D3EE" w:sz="4"/>
+              <w:right w:val="single" w:color="D9D3EE" w:sz="4"/>
+            </w:tcBorders>
+            <w:tcMar>
+              <w:top w:type="dxa" w:w="70"/>
+              <w:left w:type="dxa" w:w="100"/>
+              <w:bottom w:type="dxa" w:w="70"/>
+              <w:right w:type="dxa" w:w="100"/>
+            </w:tcMar>
+            <w:vAlign w:val="center"/>
+          </w:tcPr>
+          <w:p>
+            <w:pPr>
+              <w:jc w:val="center"/>
+            </w:pPr>
+            <w:r>
+              <w:rPr>
+                <w:rFonts w:ascii="Calibri" w:cs="Calibri" w:eastAsia="Calibri" w:hAnsi="Calibri"/>
+                <w:b/>
+                <w:bCs/>
+                <w:color w:val="1C1A3A"/>
+                <w:sz w:val="19"/>
+                <w:szCs w:val="19"/>
+              </w:rPr>
+              <w:t xml:space="preserve">790 € + 700 € = 1.490 €</w:t>
+            </w:r>
+          </w:p>
+        </w:tc>
+        <w:tc>
+          <w:tcPr>
+            <w:tcW w:type="dxa" w:w="1500"/>
+            <w:tcBorders>
+              <w:top w:val="single" w:color="D9D3EE" w:sz="4"/>
+              <w:left w:val="single" w:color="D9D3EE" w:sz="4"/>
+              <w:bottom w:val="single" w:color="D9D3EE" w:sz="4"/>
+              <w:right w:val="single" w:color="D9D3EE" w:sz="4"/>
+            </w:tcBorders>
+            <w:tcMar>
+              <w:top w:type="dxa" w:w="70"/>
+              <w:left w:type="dxa" w:w="100"/>
+              <w:bottom w:type="dxa" w:w="70"/>
+              <w:right w:type="dxa" w:w="100"/>
+            </w:tcMar>
+            <w:vAlign w:val="center"/>
+          </w:tcPr>
+          <w:p>
+            <w:pPr>
+              <w:jc w:val="center"/>
+            </w:pPr>
+            <w:r>
+              <w:rPr>
+                <w:rFonts w:ascii="Calibri" w:cs="Calibri" w:eastAsia="Calibri" w:hAnsi="Calibri"/>
+                <w:color w:val="1C1A3A"/>
+                <w:sz w:val="19"/>
+                <w:szCs w:val="19"/>
+              </w:rPr>
+              <w:t xml:space="preserve">55 €/mes</w:t>
+            </w:r>
+          </w:p>
+        </w:tc>
+        <w:tc>
+          <w:tcPr>
+            <w:tcW w:type="dxa" w:w="2238"/>
+            <w:tcBorders>
+              <w:top w:val="single" w:color="D9D3EE" w:sz="4"/>
+              <w:left w:val="single" w:color="D9D3EE" w:sz="4"/>
+              <w:bottom w:val="single" w:color="D9D3EE" w:sz="4"/>
+              <w:right w:val="single" w:color="D9D3EE" w:sz="4"/>
+            </w:tcBorders>
+            <w:tcMar>
+              <w:top w:type="dxa" w:w="70"/>
+              <w:left w:type="dxa" w:w="100"/>
+              <w:bottom w:type="dxa" w:w="70"/>
+              <w:right w:type="dxa" w:w="100"/>
+            </w:tcMar>
+            <w:vAlign w:val="center"/>
+          </w:tcPr>
+          <w:p>
+            <w:pPr>
+              <w:jc w:val="center"/>
+            </w:pPr>
+            <w:r>
+              <w:rPr>
+                <w:rFonts w:ascii="Calibri" w:cs="Calibri" w:eastAsia="Calibri" w:hAnsi="Calibri"/>
+                <w:b/>
+                <w:bCs/>
+                <w:color w:val="6D3AE8"/>
+                <w:sz w:val="19"/>
+                <w:szCs w:val="19"/>
+              </w:rPr>
+              <w:t xml:space="preserve">25 a 35 días hábiles</w:t>
+            </w:r>
+          </w:p>
+        </w:tc>
+      </w:tr>
+      <w:tr>
+        <w:trPr>
+          <w:cantSplit/>
+        </w:trPr>
+        <w:tc>
+          <w:tcPr>
+            <w:tcW w:type="dxa" w:w="2800"/>
+            <w:tcBorders>
+              <w:top w:val="single" w:color="D9D3EE" w:sz="4"/>
+              <w:left w:val="single" w:color="D9D3EE" w:sz="4"/>
+              <w:bottom w:val="single" w:color="D9D3EE" w:sz="4"/>
+              <w:right w:val="single" w:color="D9D3EE" w:sz="4"/>
+            </w:tcBorders>
+            <w:tcMar>
+              <w:top w:type="dxa" w:w="70"/>
+              <w:left w:type="dxa" w:w="100"/>
+              <w:bottom w:type="dxa" w:w="70"/>
+              <w:right w:type="dxa" w:w="100"/>
+            </w:tcMar>
+            <w:vAlign w:val="center"/>
+          </w:tcPr>
+          <w:p>
+            <w:pPr>
+              <w:jc w:val="left"/>
+            </w:pPr>
+            <w:r>
+              <w:rPr>
+                <w:rFonts w:ascii="Calibri" w:cs="Calibri" w:eastAsia="Calibri" w:hAnsi="Calibri"/>
+                <w:b/>
+                <w:bCs/>
+                <w:color w:val="1C1A3A"/>
+                <w:sz w:val="19"/>
+                <w:szCs w:val="19"/>
+              </w:rPr>
+              <w:t xml:space="preserve">D · Tienda + proveedor</w:t>
+            </w:r>
+          </w:p>
+        </w:tc>
+        <w:tc>
+          <w:tcPr>
+            <w:tcW w:type="dxa" w:w="3100"/>
+            <w:tcBorders>
+              <w:top w:val="single" w:color="D9D3EE" w:sz="4"/>
+              <w:left w:val="single" w:color="D9D3EE" w:sz="4"/>
+              <w:bottom w:val="single" w:color="D9D3EE" w:sz="4"/>
+              <w:right w:val="single" w:color="D9D3EE" w:sz="4"/>
+            </w:tcBorders>
+            <w:tcMar>
+              <w:top w:type="dxa" w:w="70"/>
+              <w:left w:type="dxa" w:w="100"/>
+              <w:bottom w:type="dxa" w:w="70"/>
+              <w:right w:type="dxa" w:w="100"/>
+            </w:tcMar>
+            <w:vAlign w:val="center"/>
+          </w:tcPr>
+          <w:p>
+            <w:pPr>
+              <w:jc w:val="center"/>
+            </w:pPr>
+            <w:r>
+              <w:rPr>
+                <w:rFonts w:ascii="Calibri" w:cs="Calibri" w:eastAsia="Calibri" w:hAnsi="Calibri"/>
+                <w:b/>
+                <w:bCs/>
+                <w:color w:val="1C1A3A"/>
+                <w:sz w:val="19"/>
+                <w:szCs w:val="19"/>
+              </w:rPr>
+              <w:t xml:space="preserve">1.180 € + 700 € = 1.880 €</w:t>
+            </w:r>
+          </w:p>
+        </w:tc>
+        <w:tc>
+          <w:tcPr>
+            <w:tcW w:type="dxa" w:w="1500"/>
+            <w:tcBorders>
+              <w:top w:val="single" w:color="D9D3EE" w:sz="4"/>
+              <w:left w:val="single" w:color="D9D3EE" w:sz="4"/>
+              <w:bottom w:val="single" w:color="D9D3EE" w:sz="4"/>
+              <w:right w:val="single" w:color="D9D3EE" w:sz="4"/>
+            </w:tcBorders>
+            <w:tcMar>
+              <w:top w:type="dxa" w:w="70"/>
+              <w:left w:type="dxa" w:w="100"/>
+              <w:bottom w:type="dxa" w:w="70"/>
+              <w:right w:type="dxa" w:w="100"/>
+            </w:tcMar>
+            <w:vAlign w:val="center"/>
+          </w:tcPr>
+          <w:p>
+            <w:pPr>
+              <w:jc w:val="center"/>
+            </w:pPr>
+            <w:r>
+              <w:rPr>
+                <w:rFonts w:ascii="Calibri" w:cs="Calibri" w:eastAsia="Calibri" w:hAnsi="Calibri"/>
+                <w:color w:val="1C1A3A"/>
+                <w:sz w:val="19"/>
+                <w:szCs w:val="19"/>
+              </w:rPr>
+              <w:t xml:space="preserve">70 €/mes</w:t>
+            </w:r>
+          </w:p>
+        </w:tc>
+        <w:tc>
+          <w:tcPr>
+            <w:tcW w:type="dxa" w:w="2238"/>
+            <w:tcBorders>
+              <w:top w:val="single" w:color="D9D3EE" w:sz="4"/>
+              <w:left w:val="single" w:color="D9D3EE" w:sz="4"/>
+              <w:bottom w:val="single" w:color="D9D3EE" w:sz="4"/>
+              <w:right w:val="single" w:color="D9D3EE" w:sz="4"/>
+            </w:tcBorders>
+            <w:tcMar>
+              <w:top w:type="dxa" w:w="70"/>
+              <w:left w:type="dxa" w:w="100"/>
+              <w:bottom w:type="dxa" w:w="70"/>
+              <w:right w:type="dxa" w:w="100"/>
+            </w:tcMar>
+            <w:vAlign w:val="center"/>
+          </w:tcPr>
+          <w:p>
+            <w:pPr>
+              <w:jc w:val="center"/>
+            </w:pPr>
+            <w:r>
+              <w:rPr>
+                <w:rFonts w:ascii="Calibri" w:cs="Calibri" w:eastAsia="Calibri" w:hAnsi="Calibri"/>
+                <w:b/>
+                <w:bCs/>
+                <w:color w:val="6D3AE8"/>
+                <w:sz w:val="19"/>
+                <w:szCs w:val="19"/>
+              </w:rPr>
+              <w:t xml:space="preserve">30 a 40 días hábiles</w:t>
+            </w:r>
+          </w:p>
+        </w:tc>
+      </w:tr>
+    </w:tbl>
+    <w:p>
+      <w:pPr>
+        <w:spacing w:after="60" w:before="80"/>
+      </w:pPr>
+      <w:r>
+        <w:rPr>
+          <w:rFonts w:ascii="Calibri" w:cs="Calibri" w:eastAsia="Calibri" w:hAnsi="Calibri"/>
+          <w:color w:val="1C1A3A"/>
+          <w:sz w:val="21"/>
+          <w:szCs w:val="21"/>
+        </w:rPr>
+        <w:t xml:space="preserve">Importes sin IVA. El paquete B (botón de pago en 15 productos) no encaja con 1.200: para cobrar online con todo el catálogo, elige la tienda (C o D).</w:t>
+      </w:r>
+    </w:p>
+    <w:p>
+      <w:pPr>
+        <w:keepNext/>
+        <w:spacing w:after="40" w:before="100"/>
+      </w:pPr>
+      <w:r>
+        <w:rPr>
+          <w:rFonts w:ascii="Calibri" w:cs="Calibri" w:eastAsia="Calibri" w:hAnsi="Calibri"/>
+          <w:b/>
+          <w:bCs/>
+          <w:color w:val="6D3AE8"/>
+          <w:sz w:val="21"/>
+          <w:szCs w:val="21"/>
+        </w:rPr>
+        <w:t xml:space="preserve">Qué incluye</w:t>
+      </w:r>
+    </w:p>
+    <w:p>
+      <w:pPr>
+        <w:pStyle w:val="ListParagraph"/>
+        <w:numPr>
+          <w:ilvl w:val="0"/>
+          <w:numId w:val="2"/>
+        </w:numPr>
+        <w:spacing w:after="50" w:line="280"/>
+      </w:pPr>
+      <w:r>
+        <w:rPr>
+          <w:rFonts w:ascii="Calibri" w:cs="Calibri" w:eastAsia="Calibri" w:hAnsi="Calibri"/>
+          <w:color w:val="1C1A3A"/>
+          <w:sz w:val="21"/>
+          <w:szCs w:val="21"/>
+        </w:rPr>
+        <w:t xml:space="preserve">Carga masiva desde tu hoja de cálculo (no se escribe producto a producto).</w:t>
+      </w:r>
+    </w:p>
+    <w:p>
+      <w:pPr>
+        <w:pStyle w:val="ListParagraph"/>
+        <w:numPr>
+          <w:ilvl w:val="0"/>
+          <w:numId w:val="2"/>
+        </w:numPr>
+        <w:spacing w:after="50" w:line="280"/>
+      </w:pPr>
+      <w:r>
+        <w:rPr>
+          <w:rFonts w:ascii="Calibri" w:cs="Calibri" w:eastAsia="Calibri" w:hAnsi="Calibri"/>
+          <w:color w:val="1C1A3A"/>
+          <w:sz w:val="21"/>
+          <w:szCs w:val="21"/>
+        </w:rPr>
+        <w:t xml:space="preserve">Buscador por nombre, color o referencia, y filtros por categoría.</w:t>
+      </w:r>
+    </w:p>
+    <w:p>
+      <w:pPr>
+        <w:pStyle w:val="ListParagraph"/>
+        <w:numPr>
+          <w:ilvl w:val="0"/>
+          <w:numId w:val="2"/>
+        </w:numPr>
+        <w:spacing w:after="50" w:line="280"/>
+      </w:pPr>
+      <w:r>
+        <w:rPr>
+          <w:rFonts w:ascii="Calibri" w:cs="Calibri" w:eastAsia="Calibri" w:hAnsi="Calibri"/>
+          <w:color w:val="1C1A3A"/>
+          <w:sz w:val="21"/>
+          <w:szCs w:val="21"/>
+        </w:rPr>
+        <w:t xml:space="preserve">«Mi pedido»: tus clientes añaden varios productos y te los mandan en un solo mensaje de WhatsApp, con el total estimado.</w:t>
+      </w:r>
+    </w:p>
+    <w:p>
+      <w:pPr>
+        <w:pStyle w:val="ListParagraph"/>
+        <w:numPr>
+          <w:ilvl w:val="0"/>
+          <w:numId w:val="2"/>
+        </w:numPr>
+        <w:spacing w:after="50" w:line="280"/>
+      </w:pPr>
+      <w:r>
+        <w:rPr>
+          <w:rFonts w:ascii="Calibri" w:cs="Calibri" w:eastAsia="Calibri" w:hAnsi="Calibri"/>
+          <w:color w:val="1C1A3A"/>
+          <w:sz w:val="21"/>
+          <w:szCs w:val="21"/>
+        </w:rPr>
+        <w:t xml:space="preserve">Precios por menor y por mayor, con las unidades mínimas de cada producto.</w:t>
+      </w:r>
+    </w:p>
+    <w:p>
+      <w:pPr>
+        <w:pStyle w:val="ListParagraph"/>
+        <w:numPr>
+          <w:ilvl w:val="0"/>
+          <w:numId w:val="2"/>
+        </w:numPr>
+        <w:spacing w:after="50" w:line="280"/>
+      </w:pPr>
+      <w:r>
+        <w:rPr>
+          <w:rFonts w:ascii="Calibri" w:cs="Calibri" w:eastAsia="Calibri" w:hAnsi="Calibri"/>
+          <w:color w:val="1C1A3A"/>
+          <w:sz w:val="21"/>
+          <w:szCs w:val="21"/>
+        </w:rPr>
+        <w:t xml:space="preserve">Fotos optimizadas para que la web cargue rápido en el móvil.</w:t>
+      </w:r>
+    </w:p>
+    <w:p>
+      <w:pPr>
+        <w:pStyle w:val="ListParagraph"/>
+        <w:numPr>
+          <w:ilvl w:val="0"/>
+          <w:numId w:val="2"/>
+        </w:numPr>
+        <w:spacing w:after="50" w:line="280"/>
+      </w:pPr>
+      <w:r>
+        <w:rPr>
+          <w:rFonts w:ascii="Calibri" w:cs="Calibri" w:eastAsia="Calibri" w:hAnsi="Calibri"/>
+          <w:color w:val="1C1A3A"/>
+          <w:sz w:val="21"/>
+          <w:szCs w:val="21"/>
+        </w:rPr>
+        <w:t xml:space="preserve">Salida por tandas: publicamos con tus 150 a 200 productos más vendidos y subimos el resto durante las dos semanas siguientes.</w:t>
+      </w:r>
+    </w:p>
+    <w:p>
+      <w:pPr>
+        <w:keepNext/>
+        <w:spacing w:after="40" w:before="100"/>
+      </w:pPr>
+      <w:r>
+        <w:rPr>
+          <w:rFonts w:ascii="Calibri" w:cs="Calibri" w:eastAsia="Calibri" w:hAnsi="Calibri"/>
+          <w:b/>
+          <w:bCs/>
+          <w:color w:val="6D3AE8"/>
+          <w:sz w:val="21"/>
+          <w:szCs w:val="21"/>
+        </w:rPr>
+        <w:t xml:space="preserve">Qué necesitamos de ti</w:t>
+      </w:r>
+    </w:p>
+    <w:p>
+      <w:pPr>
+        <w:pStyle w:val="ListParagraph"/>
+        <w:numPr>
+          <w:ilvl w:val="0"/>
+          <w:numId w:val="2"/>
+        </w:numPr>
+        <w:spacing w:after="50" w:line="280"/>
+      </w:pPr>
+      <w:r>
+        <w:rPr>
+          <w:rFonts w:ascii="Calibri" w:cs="Calibri" w:eastAsia="Calibri" w:hAnsi="Calibri"/>
+          <w:color w:val="1C1A3A"/>
+          <w:sz w:val="21"/>
+          <w:szCs w:val="21"/>
+        </w:rPr>
+        <w:t xml:space="preserve">Una hoja de cálculo (Excel) con una fila por producto y estas columnas: referencia, nombre, categoría, medidas o variantes, colores, precio por menor, precio por mayor, unidades mínimas por mayor y nombre del archivo de la foto.</w:t>
+      </w:r>
+    </w:p>
+    <w:p>
+      <w:pPr>
+        <w:pStyle w:val="ListParagraph"/>
+        <w:numPr>
+          <w:ilvl w:val="0"/>
+          <w:numId w:val="2"/>
+        </w:numPr>
+        <w:spacing w:after="50" w:line="280"/>
+      </w:pPr>
+      <w:r>
+        <w:rPr>
+          <w:rFonts w:ascii="Calibri" w:cs="Calibri" w:eastAsia="Calibri" w:hAnsi="Calibri"/>
+          <w:color w:val="1C1A3A"/>
+          <w:sz w:val="21"/>
+          <w:szCs w:val="21"/>
+        </w:rPr>
+        <w:t xml:space="preserve">Una carpeta con las fotos, con el nombre de archivo de cada producto.</w:t>
+      </w:r>
+    </w:p>
+    <w:p>
+      <w:pPr>
+        <w:pStyle w:val="ListParagraph"/>
+        <w:numPr>
+          <w:ilvl w:val="0"/>
+          <w:numId w:val="2"/>
+        </w:numPr>
+        <w:spacing w:after="50" w:line="280"/>
+      </w:pPr>
+      <w:r>
+        <w:rPr>
+          <w:rFonts w:ascii="Calibri" w:cs="Calibri" w:eastAsia="Calibri" w:hAnsi="Calibri"/>
+          <w:color w:val="1C1A3A"/>
+          <w:sz w:val="21"/>
+          <w:szCs w:val="21"/>
+        </w:rPr>
+        <w:t xml:space="preserve">Si no tienes la hoja, la preparamos nosotros por 1,50 € por producto (1.200 productos: 1.800 €). Lo más rápido es que la mandes tú.</w:t>
+      </w:r>
+    </w:p>
+    <w:p>
+      <w:pPr>
+        <w:spacing w:after="60" w:before="100"/>
+      </w:pPr>
+      <w:r>
+        <w:rPr>
+          <w:rFonts w:ascii="Calibri" w:cs="Calibri" w:eastAsia="Calibri" w:hAnsi="Calibri"/>
+          <w:b/>
+          <w:bCs/>
+          <w:color w:val="1C1A3A"/>
+          <w:sz w:val="21"/>
+          <w:szCs w:val="21"/>
+        </w:rPr>
+        <w:t xml:space="preserve">Salida por tandas: </w:t>
+      </w:r>
+      <w:r>
+        <w:rPr>
+          <w:rFonts w:ascii="Calibri" w:cs="Calibri" w:eastAsia="Calibri" w:hAnsi="Calibri"/>
+          <w:color w:val="1C1A3A"/>
+          <w:sz w:val="21"/>
+          <w:szCs w:val="21"/>
+        </w:rPr>
+        <w:t xml:space="preserve">con los 150 a 200 productos más vendidos y la hoja de cálculo del resto en nuestras manos, publicamos en 7 a 10 días hábiles y vamos subiendo el resto en las dos semanas siguientes, sin costes extra.</w:t>
+      </w:r>
+    </w:p>
+    <w:p>
+      <w:pPr>
+        <w:spacing w:after="100" w:line="290"/>
+      </w:pPr>
+      <w:r>
+        <w:rPr>
+          <w:rFonts w:ascii="Calibri" w:cs="Calibri" w:eastAsia="Calibri" w:hAnsi="Calibri"/>
+          <w:color w:val="1C1A3A"/>
+          <w:sz w:val="21"/>
+          <w:szCs w:val="21"/>
+        </w:rPr>
+        <w:t xml:space="preserve">Estos plazos cuentan desde que recibimos la hoja de cálculo completa, las fotos y el primer pago. El camino crítico es tener lista esa información: si llega por tandas, el plazo se alarga.</w:t>
+      </w:r>
+    </w:p>
+    <w:p>
+      <w:pPr>
+        <w:keepNext/>
+        <w:pBdr>
+          <w:bottom w:val="single" w:color="6D3AE8" w:sz="6" w:space="3"/>
+        </w:pBdr>
+        <w:spacing w:after="90" w:before="260"/>
+      </w:pPr>
+      <w:r>
+        <w:rPr>
+          <w:rFonts w:ascii="Calibri" w:cs="Calibri" w:eastAsia="Calibri" w:hAnsi="Calibri"/>
+          <w:b/>
+          <w:bCs/>
+          <w:color w:val="1C1A3A"/>
+          <w:sz w:val="28"/>
+          <w:szCs w:val="28"/>
+        </w:rPr>
+        <w:t xml:space="preserve">Cuánto tardamos (catálogo de hasta 30 productos)</w:t>
       </w:r>
     </w:p>
     <w:p>

</xml_diff>

<commit_message>
Hogar textil: modelo híbrido (230 piezas propias + modelos de proveedores) en demo y oferta
Co-Authored-By: Claude Sonnet 5.5 <noreply@anthropic.com>
Claude-Session: https://claude.ai/code/session_012pES2kzzzwPEYsotem2e5X
</commit_message>
<xml_diff>
--- a/ofertas/hogar-textil/oferta/Oferta-web-textil-hogar.docx
+++ b/ofertas/hogar-textil/oferta/Oferta-web-textil-hogar.docx
@@ -3069,7 +3069,7 @@
           <w:sz w:val="28"/>
           <w:szCs w:val="28"/>
         </w:rPr>
-        <w:t xml:space="preserve">Tu caso: un catálogo de unos 1.200 productos</w:t>
+        <w:t xml:space="preserve">Tu caso: 230 piezas propias + modelos de tus proveedores</w:t>
       </w:r>
     </w:p>
     <w:p>
@@ -3083,24 +3083,7 @@
           <w:sz w:val="21"/>
           <w:szCs w:val="21"/>
         </w:rPr>
-        <w:t xml:space="preserve">Con unos 1.200 productos no se carga producto a producto. Trabajamos desde tu hoja de cálculo y publicamos por tandas para que estés vendiendo cuanto antes.</w:t>
-      </w:r>
-    </w:p>
-    <w:p>
-      <w:pPr>
-        <w:keepNext/>
-        <w:spacing w:after="40" w:before="100"/>
-      </w:pPr>
-      <w:r>
-        <w:rPr>
-          <w:rFonts w:ascii="Calibri" w:cs="Calibri" w:eastAsia="Calibri" w:hAnsi="Calibri"/>
-          <w:b/>
-          <w:bCs/>
-          <w:color w:val="6D3AE8"/>
-          <w:sz w:val="21"/>
-          <w:szCs w:val="21"/>
-        </w:rPr>
-        <w:t xml:space="preserve">Carga del catálogo (se suma al paquete)</w:t>
+        <w:t xml:space="preserve">Muestras todo lo que ofrecen tus proveedores y, cuando el modelo no lo tienes, lo envía el proveedor directamente a tu cliente. Cargamos todo desde hojas de cálculo, no producto a producto.</w:t>
       </w:r>
     </w:p>
     <w:tbl>
@@ -3116,9 +3099,10 @@
         </w:tblBorders>
       </w:tblPr>
       <w:tblGrid>
-        <w:gridCol w:w="4000"/>
-        <w:gridCol w:w="2800"/>
-        <w:gridCol w:w="2838"/>
+        <w:gridCol w:w="3700"/>
+        <w:gridCol w:w="2600"/>
+        <w:gridCol w:w="1200"/>
+        <w:gridCol w:w="2138"/>
       </w:tblGrid>
       <w:tr>
         <w:trPr>
@@ -3126,7 +3110,7 @@
         </w:trPr>
         <w:tc>
           <w:tcPr>
-            <w:tcW w:type="dxa" w:w="4000"/>
+            <w:tcW w:type="dxa" w:w="3700"/>
             <w:tcBorders>
               <w:top w:val="single" w:color="D9D3EE" w:sz="4"/>
               <w:left w:val="single" w:color="D9D3EE" w:sz="4"/>
@@ -3155,13 +3139,13 @@
                 <w:sz w:val="19"/>
                 <w:szCs w:val="19"/>
               </w:rPr>
-              <w:t xml:space="preserve">Tamaño del catálogo</w:t>
-            </w:r>
-          </w:p>
-        </w:tc>
-        <w:tc>
-          <w:tcPr>
-            <w:tcW w:type="dxa" w:w="2800"/>
+              <w:t xml:space="preserve">Opciones para tu caso</w:t>
+            </w:r>
+          </w:p>
+        </w:tc>
+        <w:tc>
+          <w:tcPr>
+            <w:tcW w:type="dxa" w:w="2600"/>
             <w:tcBorders>
               <w:top w:val="single" w:color="D9D3EE" w:sz="4"/>
               <w:left w:val="single" w:color="D9D3EE" w:sz="4"/>
@@ -3196,7 +3180,7 @@
         </w:tc>
         <w:tc>
           <w:tcPr>
-            <w:tcW w:type="dxa" w:w="2838"/>
+            <w:tcW w:type="dxa" w:w="1200"/>
             <w:tcBorders>
               <w:top w:val="single" w:color="D9D3EE" w:sz="4"/>
               <w:left w:val="single" w:color="D9D3EE" w:sz="4"/>
@@ -3225,7 +3209,42 @@
                 <w:sz w:val="19"/>
                 <w:szCs w:val="19"/>
               </w:rPr>
-              <w:t xml:space="preserve">Cuota mensual</w:t>
+              <w:t xml:space="preserve">Cuota</w:t>
+            </w:r>
+          </w:p>
+        </w:tc>
+        <w:tc>
+          <w:tcPr>
+            <w:tcW w:type="dxa" w:w="2138"/>
+            <w:tcBorders>
+              <w:top w:val="single" w:color="D9D3EE" w:sz="4"/>
+              <w:left w:val="single" w:color="D9D3EE" w:sz="4"/>
+              <w:bottom w:val="single" w:color="D9D3EE" w:sz="4"/>
+              <w:right w:val="single" w:color="D9D3EE" w:sz="4"/>
+            </w:tcBorders>
+            <w:shd w:fill="F1EDFF" w:color="auto" w:val="clear"/>
+            <w:tcMar>
+              <w:top w:type="dxa" w:w="70"/>
+              <w:left w:type="dxa" w:w="100"/>
+              <w:bottom w:type="dxa" w:w="70"/>
+              <w:right w:type="dxa" w:w="100"/>
+            </w:tcMar>
+            <w:vAlign w:val="center"/>
+          </w:tcPr>
+          <w:p>
+            <w:pPr>
+              <w:jc w:val="center"/>
+            </w:pPr>
+            <w:r>
+              <w:rPr>
+                <w:rFonts w:ascii="Calibri" w:cs="Calibri" w:eastAsia="Calibri" w:hAnsi="Calibri"/>
+                <w:b/>
+                <w:bCs/>
+                <w:color w:val="6D3AE8"/>
+                <w:sz w:val="19"/>
+                <w:szCs w:val="19"/>
+              </w:rPr>
+              <w:t xml:space="preserve">Plazo</w:t>
             </w:r>
           </w:p>
         </w:tc>
@@ -3236,7 +3255,7 @@
         </w:trPr>
         <w:tc>
           <w:tcPr>
-            <w:tcW w:type="dxa" w:w="4000"/>
+            <w:tcW w:type="dxa" w:w="3700"/>
             <w:tcBorders>
               <w:top w:val="single" w:color="D9D3EE" w:sz="4"/>
               <w:left w:val="single" w:color="D9D3EE" w:sz="4"/>
@@ -3258,49 +3277,53 @@
             <w:r>
               <w:rPr>
                 <w:rFonts w:ascii="Calibri" w:cs="Calibri" w:eastAsia="Calibri" w:hAnsi="Calibri"/>
+                <w:b/>
+                <w:bCs/>
                 <w:color w:val="1C1A3A"/>
-                <w:sz w:val="19"/>
-                <w:szCs w:val="19"/>
-              </w:rPr>
-              <w:t xml:space="preserve">Hasta 100 productos</w:t>
-            </w:r>
-          </w:p>
-        </w:tc>
-        <w:tc>
-          <w:tcPr>
-            <w:tcW w:type="dxa" w:w="2800"/>
-            <w:tcBorders>
-              <w:top w:val="single" w:color="D9D3EE" w:sz="4"/>
-              <w:left w:val="single" w:color="D9D3EE" w:sz="4"/>
-              <w:bottom w:val="single" w:color="D9D3EE" w:sz="4"/>
-              <w:right w:val="single" w:color="D9D3EE" w:sz="4"/>
-            </w:tcBorders>
-            <w:tcMar>
-              <w:top w:type="dxa" w:w="70"/>
-              <w:left w:type="dxa" w:w="100"/>
-              <w:bottom w:type="dxa" w:w="70"/>
-              <w:right w:type="dxa" w:w="100"/>
-            </w:tcMar>
-            <w:vAlign w:val="center"/>
-          </w:tcPr>
-          <w:p>
-            <w:pPr>
-              <w:jc w:val="center"/>
-            </w:pPr>
-            <w:r>
-              <w:rPr>
-                <w:rFonts w:ascii="Calibri" w:cs="Calibri" w:eastAsia="Calibri" w:hAnsi="Calibri"/>
+                <w:sz w:val="18"/>
+                <w:szCs w:val="18"/>
+              </w:rPr>
+              <w:t xml:space="preserve">A · Catálogo + WhatsApp con tus 230 piezas</w:t>
+            </w:r>
+          </w:p>
+        </w:tc>
+        <w:tc>
+          <w:tcPr>
+            <w:tcW w:type="dxa" w:w="2600"/>
+            <w:tcBorders>
+              <w:top w:val="single" w:color="D9D3EE" w:sz="4"/>
+              <w:left w:val="single" w:color="D9D3EE" w:sz="4"/>
+              <w:bottom w:val="single" w:color="D9D3EE" w:sz="4"/>
+              <w:right w:val="single" w:color="D9D3EE" w:sz="4"/>
+            </w:tcBorders>
+            <w:tcMar>
+              <w:top w:type="dxa" w:w="70"/>
+              <w:left w:type="dxa" w:w="100"/>
+              <w:bottom w:type="dxa" w:w="70"/>
+              <w:right w:type="dxa" w:w="100"/>
+            </w:tcMar>
+            <w:vAlign w:val="center"/>
+          </w:tcPr>
+          <w:p>
+            <w:pPr>
+              <w:jc w:val="center"/>
+            </w:pPr>
+            <w:r>
+              <w:rPr>
+                <w:rFonts w:ascii="Calibri" w:cs="Calibri" w:eastAsia="Calibri" w:hAnsi="Calibri"/>
+                <w:b/>
+                <w:bCs/>
                 <w:color w:val="1C1A3A"/>
-                <w:sz w:val="19"/>
-                <w:szCs w:val="19"/>
-              </w:rPr>
-              <w:t xml:space="preserve">+120 €</w:t>
-            </w:r>
-          </w:p>
-        </w:tc>
-        <w:tc>
-          <w:tcPr>
-            <w:tcW w:type="dxa" w:w="2838"/>
+                <w:sz w:val="18"/>
+                <w:szCs w:val="18"/>
+              </w:rPr>
+              <w:t xml:space="preserve">295 € + 250 € = 545 €</w:t>
+            </w:r>
+          </w:p>
+        </w:tc>
+        <w:tc>
+          <w:tcPr>
+            <w:tcW w:type="dxa" w:w="1200"/>
             <w:tcBorders>
               <w:top w:val="single" w:color="D9D3EE" w:sz="4"/>
               <w:left w:val="single" w:color="D9D3EE" w:sz="4"/>
@@ -3326,7 +3349,41 @@
                 <w:sz w:val="19"/>
                 <w:szCs w:val="19"/>
               </w:rPr>
-              <w:t xml:space="preserve">Sin cambio</w:t>
+              <w:t xml:space="preserve">25 €/mes</w:t>
+            </w:r>
+          </w:p>
+        </w:tc>
+        <w:tc>
+          <w:tcPr>
+            <w:tcW w:type="dxa" w:w="2138"/>
+            <w:tcBorders>
+              <w:top w:val="single" w:color="D9D3EE" w:sz="4"/>
+              <w:left w:val="single" w:color="D9D3EE" w:sz="4"/>
+              <w:bottom w:val="single" w:color="D9D3EE" w:sz="4"/>
+              <w:right w:val="single" w:color="D9D3EE" w:sz="4"/>
+            </w:tcBorders>
+            <w:tcMar>
+              <w:top w:type="dxa" w:w="70"/>
+              <w:left w:type="dxa" w:w="100"/>
+              <w:bottom w:type="dxa" w:w="70"/>
+              <w:right w:type="dxa" w:w="100"/>
+            </w:tcMar>
+            <w:vAlign w:val="center"/>
+          </w:tcPr>
+          <w:p>
+            <w:pPr>
+              <w:jc w:val="center"/>
+            </w:pPr>
+            <w:r>
+              <w:rPr>
+                <w:rFonts w:ascii="Calibri" w:cs="Calibri" w:eastAsia="Calibri" w:hAnsi="Calibri"/>
+                <w:b/>
+                <w:bCs/>
+                <w:color w:val="6D3AE8"/>
+                <w:sz w:val="19"/>
+                <w:szCs w:val="19"/>
+              </w:rPr>
+              <w:t xml:space="preserve">7 a 10 días hábiles</w:t>
             </w:r>
           </w:p>
         </w:tc>
@@ -3337,7 +3394,7 @@
         </w:trPr>
         <w:tc>
           <w:tcPr>
-            <w:tcW w:type="dxa" w:w="4000"/>
+            <w:tcW w:type="dxa" w:w="3700"/>
             <w:tcBorders>
               <w:top w:val="single" w:color="D9D3EE" w:sz="4"/>
               <w:left w:val="single" w:color="D9D3EE" w:sz="4"/>
@@ -3359,49 +3416,53 @@
             <w:r>
               <w:rPr>
                 <w:rFonts w:ascii="Calibri" w:cs="Calibri" w:eastAsia="Calibri" w:hAnsi="Calibri"/>
+                <w:b/>
+                <w:bCs/>
                 <w:color w:val="1C1A3A"/>
-                <w:sz w:val="19"/>
-                <w:szCs w:val="19"/>
-              </w:rPr>
-              <w:t xml:space="preserve">Hasta 300 productos</w:t>
-            </w:r>
-          </w:p>
-        </w:tc>
-        <w:tc>
-          <w:tcPr>
-            <w:tcW w:type="dxa" w:w="2800"/>
-            <w:tcBorders>
-              <w:top w:val="single" w:color="D9D3EE" w:sz="4"/>
-              <w:left w:val="single" w:color="D9D3EE" w:sz="4"/>
-              <w:bottom w:val="single" w:color="D9D3EE" w:sz="4"/>
-              <w:right w:val="single" w:color="D9D3EE" w:sz="4"/>
-            </w:tcBorders>
-            <w:tcMar>
-              <w:top w:type="dxa" w:w="70"/>
-              <w:left w:type="dxa" w:w="100"/>
-              <w:bottom w:type="dxa" w:w="70"/>
-              <w:right w:type="dxa" w:w="100"/>
-            </w:tcMar>
-            <w:vAlign w:val="center"/>
-          </w:tcPr>
-          <w:p>
-            <w:pPr>
-              <w:jc w:val="center"/>
-            </w:pPr>
-            <w:r>
-              <w:rPr>
-                <w:rFonts w:ascii="Calibri" w:cs="Calibri" w:eastAsia="Calibri" w:hAnsi="Calibri"/>
+                <w:sz w:val="18"/>
+                <w:szCs w:val="18"/>
+              </w:rPr>
+              <w:t xml:space="preserve">C · Tienda online con tus 230 piezas</w:t>
+            </w:r>
+          </w:p>
+        </w:tc>
+        <w:tc>
+          <w:tcPr>
+            <w:tcW w:type="dxa" w:w="2600"/>
+            <w:tcBorders>
+              <w:top w:val="single" w:color="D9D3EE" w:sz="4"/>
+              <w:left w:val="single" w:color="D9D3EE" w:sz="4"/>
+              <w:bottom w:val="single" w:color="D9D3EE" w:sz="4"/>
+              <w:right w:val="single" w:color="D9D3EE" w:sz="4"/>
+            </w:tcBorders>
+            <w:tcMar>
+              <w:top w:type="dxa" w:w="70"/>
+              <w:left w:type="dxa" w:w="100"/>
+              <w:bottom w:type="dxa" w:w="70"/>
+              <w:right w:type="dxa" w:w="100"/>
+            </w:tcMar>
+            <w:vAlign w:val="center"/>
+          </w:tcPr>
+          <w:p>
+            <w:pPr>
+              <w:jc w:val="center"/>
+            </w:pPr>
+            <w:r>
+              <w:rPr>
+                <w:rFonts w:ascii="Calibri" w:cs="Calibri" w:eastAsia="Calibri" w:hAnsi="Calibri"/>
+                <w:b/>
+                <w:bCs/>
                 <w:color w:val="1C1A3A"/>
-                <w:sz w:val="19"/>
-                <w:szCs w:val="19"/>
-              </w:rPr>
-              <w:t xml:space="preserve">+250 €</w:t>
-            </w:r>
-          </w:p>
-        </w:tc>
-        <w:tc>
-          <w:tcPr>
-            <w:tcW w:type="dxa" w:w="2838"/>
+                <w:sz w:val="18"/>
+                <w:szCs w:val="18"/>
+              </w:rPr>
+              <w:t xml:space="preserve">790 € + 250 € = 1.040 €</w:t>
+            </w:r>
+          </w:p>
+        </w:tc>
+        <w:tc>
+          <w:tcPr>
+            <w:tcW w:type="dxa" w:w="1200"/>
             <w:tcBorders>
               <w:top w:val="single" w:color="D9D3EE" w:sz="4"/>
               <w:left w:val="single" w:color="D9D3EE" w:sz="4"/>
@@ -3427,7 +3488,41 @@
                 <w:sz w:val="19"/>
                 <w:szCs w:val="19"/>
               </w:rPr>
-              <w:t xml:space="preserve">Sin cambio</w:t>
+              <w:t xml:space="preserve">40 €/mes</w:t>
+            </w:r>
+          </w:p>
+        </w:tc>
+        <w:tc>
+          <w:tcPr>
+            <w:tcW w:type="dxa" w:w="2138"/>
+            <w:tcBorders>
+              <w:top w:val="single" w:color="D9D3EE" w:sz="4"/>
+              <w:left w:val="single" w:color="D9D3EE" w:sz="4"/>
+              <w:bottom w:val="single" w:color="D9D3EE" w:sz="4"/>
+              <w:right w:val="single" w:color="D9D3EE" w:sz="4"/>
+            </w:tcBorders>
+            <w:tcMar>
+              <w:top w:type="dxa" w:w="70"/>
+              <w:left w:type="dxa" w:w="100"/>
+              <w:bottom w:type="dxa" w:w="70"/>
+              <w:right w:type="dxa" w:w="100"/>
+            </w:tcMar>
+            <w:vAlign w:val="center"/>
+          </w:tcPr>
+          <w:p>
+            <w:pPr>
+              <w:jc w:val="center"/>
+            </w:pPr>
+            <w:r>
+              <w:rPr>
+                <w:rFonts w:ascii="Calibri" w:cs="Calibri" w:eastAsia="Calibri" w:hAnsi="Calibri"/>
+                <w:b/>
+                <w:bCs/>
+                <w:color w:val="6D3AE8"/>
+                <w:sz w:val="19"/>
+                <w:szCs w:val="19"/>
+              </w:rPr>
+              <w:t xml:space="preserve">15 a 25 días hábiles</w:t>
             </w:r>
           </w:p>
         </w:tc>
@@ -3438,7 +3533,7 @@
         </w:trPr>
         <w:tc>
           <w:tcPr>
-            <w:tcW w:type="dxa" w:w="4000"/>
+            <w:tcW w:type="dxa" w:w="3700"/>
             <w:tcBorders>
               <w:top w:val="single" w:color="D9D3EE" w:sz="4"/>
               <w:left w:val="single" w:color="D9D3EE" w:sz="4"/>
@@ -3460,49 +3555,53 @@
             <w:r>
               <w:rPr>
                 <w:rFonts w:ascii="Calibri" w:cs="Calibri" w:eastAsia="Calibri" w:hAnsi="Calibri"/>
+                <w:b/>
+                <w:bCs/>
                 <w:color w:val="1C1A3A"/>
-                <w:sz w:val="19"/>
-                <w:szCs w:val="19"/>
-              </w:rPr>
-              <w:t xml:space="preserve">Hasta 600 productos</w:t>
-            </w:r>
-          </w:p>
-        </w:tc>
-        <w:tc>
-          <w:tcPr>
-            <w:tcW w:type="dxa" w:w="2800"/>
-            <w:tcBorders>
-              <w:top w:val="single" w:color="D9D3EE" w:sz="4"/>
-              <w:left w:val="single" w:color="D9D3EE" w:sz="4"/>
-              <w:bottom w:val="single" w:color="D9D3EE" w:sz="4"/>
-              <w:right w:val="single" w:color="D9D3EE" w:sz="4"/>
-            </w:tcBorders>
-            <w:tcMar>
-              <w:top w:type="dxa" w:w="70"/>
-              <w:left w:type="dxa" w:w="100"/>
-              <w:bottom w:type="dxa" w:w="70"/>
-              <w:right w:type="dxa" w:w="100"/>
-            </w:tcMar>
-            <w:vAlign w:val="center"/>
-          </w:tcPr>
-          <w:p>
-            <w:pPr>
-              <w:jc w:val="center"/>
-            </w:pPr>
-            <w:r>
-              <w:rPr>
-                <w:rFonts w:ascii="Calibri" w:cs="Calibri" w:eastAsia="Calibri" w:hAnsi="Calibri"/>
+                <w:sz w:val="18"/>
+                <w:szCs w:val="18"/>
+              </w:rPr>
+              <w:t xml:space="preserve">D · Tienda híbrida: tus 230 piezas + los modelos de 1 proveedor (hasta 1.200 en total)</w:t>
+            </w:r>
+          </w:p>
+        </w:tc>
+        <w:tc>
+          <w:tcPr>
+            <w:tcW w:type="dxa" w:w="2600"/>
+            <w:tcBorders>
+              <w:top w:val="single" w:color="D9D3EE" w:sz="4"/>
+              <w:left w:val="single" w:color="D9D3EE" w:sz="4"/>
+              <w:bottom w:val="single" w:color="D9D3EE" w:sz="4"/>
+              <w:right w:val="single" w:color="D9D3EE" w:sz="4"/>
+            </w:tcBorders>
+            <w:tcMar>
+              <w:top w:type="dxa" w:w="70"/>
+              <w:left w:type="dxa" w:w="100"/>
+              <w:bottom w:type="dxa" w:w="70"/>
+              <w:right w:type="dxa" w:w="100"/>
+            </w:tcMar>
+            <w:vAlign w:val="center"/>
+          </w:tcPr>
+          <w:p>
+            <w:pPr>
+              <w:jc w:val="center"/>
+            </w:pPr>
+            <w:r>
+              <w:rPr>
+                <w:rFonts w:ascii="Calibri" w:cs="Calibri" w:eastAsia="Calibri" w:hAnsi="Calibri"/>
+                <w:b/>
+                <w:bCs/>
                 <w:color w:val="1C1A3A"/>
-                <w:sz w:val="19"/>
-                <w:szCs w:val="19"/>
-              </w:rPr>
-              <w:t xml:space="preserve">+420 €</w:t>
-            </w:r>
-          </w:p>
-        </w:tc>
-        <w:tc>
-          <w:tcPr>
-            <w:tcW w:type="dxa" w:w="2838"/>
+                <w:sz w:val="18"/>
+                <w:szCs w:val="18"/>
+              </w:rPr>
+              <w:t xml:space="preserve">790 € + 700 € + 390 € = 1.880 €</w:t>
+            </w:r>
+          </w:p>
+        </w:tc>
+        <w:tc>
+          <w:tcPr>
+            <w:tcW w:type="dxa" w:w="1200"/>
             <w:tcBorders>
               <w:top w:val="single" w:color="D9D3EE" w:sz="4"/>
               <w:left w:val="single" w:color="D9D3EE" w:sz="4"/>
@@ -3528,173 +3627,30 @@
                 <w:sz w:val="19"/>
                 <w:szCs w:val="19"/>
               </w:rPr>
-              <w:t xml:space="preserve">+15 €/mes</w:t>
-            </w:r>
-          </w:p>
-        </w:tc>
-      </w:tr>
-      <w:tr>
-        <w:trPr>
-          <w:cantSplit/>
-        </w:trPr>
-        <w:tc>
-          <w:tcPr>
-            <w:tcW w:type="dxa" w:w="4000"/>
-            <w:tcBorders>
-              <w:top w:val="single" w:color="D9D3EE" w:sz="4"/>
-              <w:left w:val="single" w:color="D9D3EE" w:sz="4"/>
-              <w:bottom w:val="single" w:color="D9D3EE" w:sz="4"/>
-              <w:right w:val="single" w:color="D9D3EE" w:sz="4"/>
-            </w:tcBorders>
-            <w:tcMar>
-              <w:top w:type="dxa" w:w="70"/>
-              <w:left w:type="dxa" w:w="100"/>
-              <w:bottom w:type="dxa" w:w="70"/>
-              <w:right w:type="dxa" w:w="100"/>
-            </w:tcMar>
-            <w:vAlign w:val="center"/>
-          </w:tcPr>
-          <w:p>
-            <w:pPr>
-              <w:jc w:val="left"/>
-            </w:pPr>
-            <w:r>
-              <w:rPr>
-                <w:rFonts w:ascii="Calibri" w:cs="Calibri" w:eastAsia="Calibri" w:hAnsi="Calibri"/>
-                <w:color w:val="1C1A3A"/>
-                <w:sz w:val="19"/>
-                <w:szCs w:val="19"/>
-              </w:rPr>
-              <w:t xml:space="preserve">Hasta 1.200 productos</w:t>
-            </w:r>
-          </w:p>
-        </w:tc>
-        <w:tc>
-          <w:tcPr>
-            <w:tcW w:type="dxa" w:w="2800"/>
-            <w:tcBorders>
-              <w:top w:val="single" w:color="D9D3EE" w:sz="4"/>
-              <w:left w:val="single" w:color="D9D3EE" w:sz="4"/>
-              <w:bottom w:val="single" w:color="D9D3EE" w:sz="4"/>
-              <w:right w:val="single" w:color="D9D3EE" w:sz="4"/>
-            </w:tcBorders>
-            <w:tcMar>
-              <w:top w:type="dxa" w:w="70"/>
-              <w:left w:type="dxa" w:w="100"/>
-              <w:bottom w:type="dxa" w:w="70"/>
-              <w:right w:type="dxa" w:w="100"/>
-            </w:tcMar>
-            <w:vAlign w:val="center"/>
-          </w:tcPr>
-          <w:p>
-            <w:pPr>
-              <w:jc w:val="center"/>
-            </w:pPr>
-            <w:r>
-              <w:rPr>
-                <w:rFonts w:ascii="Calibri" w:cs="Calibri" w:eastAsia="Calibri" w:hAnsi="Calibri"/>
-                <w:color w:val="1C1A3A"/>
-                <w:sz w:val="19"/>
-                <w:szCs w:val="19"/>
-              </w:rPr>
-              <w:t xml:space="preserve">+700 €</w:t>
-            </w:r>
-          </w:p>
-        </w:tc>
-        <w:tc>
-          <w:tcPr>
-            <w:tcW w:type="dxa" w:w="2838"/>
-            <w:tcBorders>
-              <w:top w:val="single" w:color="D9D3EE" w:sz="4"/>
-              <w:left w:val="single" w:color="D9D3EE" w:sz="4"/>
-              <w:bottom w:val="single" w:color="D9D3EE" w:sz="4"/>
-              <w:right w:val="single" w:color="D9D3EE" w:sz="4"/>
-            </w:tcBorders>
-            <w:tcMar>
-              <w:top w:type="dxa" w:w="70"/>
-              <w:left w:type="dxa" w:w="100"/>
-              <w:bottom w:type="dxa" w:w="70"/>
-              <w:right w:type="dxa" w:w="100"/>
-            </w:tcMar>
-            <w:vAlign w:val="center"/>
-          </w:tcPr>
-          <w:p>
-            <w:pPr>
-              <w:jc w:val="center"/>
-            </w:pPr>
-            <w:r>
-              <w:rPr>
-                <w:rFonts w:ascii="Calibri" w:cs="Calibri" w:eastAsia="Calibri" w:hAnsi="Calibri"/>
-                <w:color w:val="1C1A3A"/>
-                <w:sz w:val="19"/>
-                <w:szCs w:val="19"/>
-              </w:rPr>
-              <w:t xml:space="preserve">+15 €/mes</w:t>
-            </w:r>
-          </w:p>
-        </w:tc>
-      </w:tr>
-    </w:tbl>
-    <w:p>
-      <w:pPr>
-        <w:keepNext/>
-        <w:spacing w:after="40" w:before="160"/>
-      </w:pPr>
-      <w:r>
-        <w:rPr>
-          <w:rFonts w:ascii="Calibri" w:cs="Calibri" w:eastAsia="Calibri" w:hAnsi="Calibri"/>
-          <w:b/>
-          <w:bCs/>
-          <w:color w:val="6D3AE8"/>
-          <w:sz w:val="21"/>
-          <w:szCs w:val="21"/>
-        </w:rPr>
-        <w:t xml:space="preserve">Tu caso con 1.200 productos</w:t>
-      </w:r>
-    </w:p>
-    <w:tbl>
-      <w:tblPr>
-        <w:tblW w:type="dxa" w:w="9638"/>
-        <w:tblBorders>
-          <w:top w:val="single" w:color="auto" w:sz="4"/>
-          <w:left w:val="single" w:color="auto" w:sz="4"/>
-          <w:bottom w:val="single" w:color="auto" w:sz="4"/>
-          <w:right w:val="single" w:color="auto" w:sz="4"/>
-          <w:insideH w:val="single" w:color="auto" w:sz="4"/>
-          <w:insideV w:val="single" w:color="auto" w:sz="4"/>
-        </w:tblBorders>
-      </w:tblPr>
-      <w:tblGrid>
-        <w:gridCol w:w="2800"/>
-        <w:gridCol w:w="3100"/>
-        <w:gridCol w:w="1500"/>
-        <w:gridCol w:w="2238"/>
-      </w:tblGrid>
-      <w:tr>
-        <w:trPr>
-          <w:tblHeader/>
-        </w:trPr>
-        <w:tc>
-          <w:tcPr>
-            <w:tcW w:type="dxa" w:w="2800"/>
-            <w:tcBorders>
-              <w:top w:val="single" w:color="D9D3EE" w:sz="4"/>
-              <w:left w:val="single" w:color="D9D3EE" w:sz="4"/>
-              <w:bottom w:val="single" w:color="D9D3EE" w:sz="4"/>
-              <w:right w:val="single" w:color="D9D3EE" w:sz="4"/>
-            </w:tcBorders>
-            <w:shd w:fill="F1EDFF" w:color="auto" w:val="clear"/>
-            <w:tcMar>
-              <w:top w:type="dxa" w:w="70"/>
-              <w:left w:type="dxa" w:w="100"/>
-              <w:bottom w:type="dxa" w:w="70"/>
-              <w:right w:type="dxa" w:w="100"/>
-            </w:tcMar>
-            <w:vAlign w:val="center"/>
-          </w:tcPr>
-          <w:p>
-            <w:pPr>
-              <w:jc w:val="left"/>
+              <w:t xml:space="preserve">70 €/mes</w:t>
+            </w:r>
+          </w:p>
+        </w:tc>
+        <w:tc>
+          <w:tcPr>
+            <w:tcW w:type="dxa" w:w="2138"/>
+            <w:tcBorders>
+              <w:top w:val="single" w:color="D9D3EE" w:sz="4"/>
+              <w:left w:val="single" w:color="D9D3EE" w:sz="4"/>
+              <w:bottom w:val="single" w:color="D9D3EE" w:sz="4"/>
+              <w:right w:val="single" w:color="D9D3EE" w:sz="4"/>
+            </w:tcBorders>
+            <w:tcMar>
+              <w:top w:type="dxa" w:w="70"/>
+              <w:left w:type="dxa" w:w="100"/>
+              <w:bottom w:type="dxa" w:w="70"/>
+              <w:right w:type="dxa" w:w="100"/>
+            </w:tcMar>
+            <w:vAlign w:val="center"/>
+          </w:tcPr>
+          <w:p>
+            <w:pPr>
+              <w:jc w:val="center"/>
             </w:pPr>
             <w:r>
               <w:rPr>
@@ -3705,529 +3661,7 @@
                 <w:sz w:val="19"/>
                 <w:szCs w:val="19"/>
               </w:rPr>
-              <w:t xml:space="preserve">Paquete</w:t>
-            </w:r>
-          </w:p>
-        </w:tc>
-        <w:tc>
-          <w:tcPr>
-            <w:tcW w:type="dxa" w:w="3100"/>
-            <w:tcBorders>
-              <w:top w:val="single" w:color="D9D3EE" w:sz="4"/>
-              <w:left w:val="single" w:color="D9D3EE" w:sz="4"/>
-              <w:bottom w:val="single" w:color="D9D3EE" w:sz="4"/>
-              <w:right w:val="single" w:color="D9D3EE" w:sz="4"/>
-            </w:tcBorders>
-            <w:shd w:fill="F1EDFF" w:color="auto" w:val="clear"/>
-            <w:tcMar>
-              <w:top w:type="dxa" w:w="70"/>
-              <w:left w:type="dxa" w:w="100"/>
-              <w:bottom w:type="dxa" w:w="70"/>
-              <w:right w:type="dxa" w:w="100"/>
-            </w:tcMar>
-            <w:vAlign w:val="center"/>
-          </w:tcPr>
-          <w:p>
-            <w:pPr>
-              <w:jc w:val="center"/>
-            </w:pPr>
-            <w:r>
-              <w:rPr>
-                <w:rFonts w:ascii="Calibri" w:cs="Calibri" w:eastAsia="Calibri" w:hAnsi="Calibri"/>
-                <w:b/>
-                <w:bCs/>
-                <w:color w:val="6D3AE8"/>
-                <w:sz w:val="19"/>
-                <w:szCs w:val="19"/>
-              </w:rPr>
-              <w:t xml:space="preserve">Pago único</w:t>
-            </w:r>
-          </w:p>
-        </w:tc>
-        <w:tc>
-          <w:tcPr>
-            <w:tcW w:type="dxa" w:w="1500"/>
-            <w:tcBorders>
-              <w:top w:val="single" w:color="D9D3EE" w:sz="4"/>
-              <w:left w:val="single" w:color="D9D3EE" w:sz="4"/>
-              <w:bottom w:val="single" w:color="D9D3EE" w:sz="4"/>
-              <w:right w:val="single" w:color="D9D3EE" w:sz="4"/>
-            </w:tcBorders>
-            <w:shd w:fill="F1EDFF" w:color="auto" w:val="clear"/>
-            <w:tcMar>
-              <w:top w:type="dxa" w:w="70"/>
-              <w:left w:type="dxa" w:w="100"/>
-              <w:bottom w:type="dxa" w:w="70"/>
-              <w:right w:type="dxa" w:w="100"/>
-            </w:tcMar>
-            <w:vAlign w:val="center"/>
-          </w:tcPr>
-          <w:p>
-            <w:pPr>
-              <w:jc w:val="center"/>
-            </w:pPr>
-            <w:r>
-              <w:rPr>
-                <w:rFonts w:ascii="Calibri" w:cs="Calibri" w:eastAsia="Calibri" w:hAnsi="Calibri"/>
-                <w:b/>
-                <w:bCs/>
-                <w:color w:val="6D3AE8"/>
-                <w:sz w:val="19"/>
-                <w:szCs w:val="19"/>
-              </w:rPr>
-              <w:t xml:space="preserve">Cuota</w:t>
-            </w:r>
-          </w:p>
-        </w:tc>
-        <w:tc>
-          <w:tcPr>
-            <w:tcW w:type="dxa" w:w="2238"/>
-            <w:tcBorders>
-              <w:top w:val="single" w:color="D9D3EE" w:sz="4"/>
-              <w:left w:val="single" w:color="D9D3EE" w:sz="4"/>
-              <w:bottom w:val="single" w:color="D9D3EE" w:sz="4"/>
-              <w:right w:val="single" w:color="D9D3EE" w:sz="4"/>
-            </w:tcBorders>
-            <w:shd w:fill="F1EDFF" w:color="auto" w:val="clear"/>
-            <w:tcMar>
-              <w:top w:type="dxa" w:w="70"/>
-              <w:left w:type="dxa" w:w="100"/>
-              <w:bottom w:type="dxa" w:w="70"/>
-              <w:right w:type="dxa" w:w="100"/>
-            </w:tcMar>
-            <w:vAlign w:val="center"/>
-          </w:tcPr>
-          <w:p>
-            <w:pPr>
-              <w:jc w:val="center"/>
-            </w:pPr>
-            <w:r>
-              <w:rPr>
-                <w:rFonts w:ascii="Calibri" w:cs="Calibri" w:eastAsia="Calibri" w:hAnsi="Calibri"/>
-                <w:b/>
-                <w:bCs/>
-                <w:color w:val="6D3AE8"/>
-                <w:sz w:val="19"/>
-                <w:szCs w:val="19"/>
-              </w:rPr>
-              <w:t xml:space="preserve">Plazo</w:t>
-            </w:r>
-          </w:p>
-        </w:tc>
-      </w:tr>
-      <w:tr>
-        <w:trPr>
-          <w:cantSplit/>
-        </w:trPr>
-        <w:tc>
-          <w:tcPr>
-            <w:tcW w:type="dxa" w:w="2800"/>
-            <w:tcBorders>
-              <w:top w:val="single" w:color="D9D3EE" w:sz="4"/>
-              <w:left w:val="single" w:color="D9D3EE" w:sz="4"/>
-              <w:bottom w:val="single" w:color="D9D3EE" w:sz="4"/>
-              <w:right w:val="single" w:color="D9D3EE" w:sz="4"/>
-            </w:tcBorders>
-            <w:tcMar>
-              <w:top w:type="dxa" w:w="70"/>
-              <w:left w:type="dxa" w:w="100"/>
-              <w:bottom w:type="dxa" w:w="70"/>
-              <w:right w:type="dxa" w:w="100"/>
-            </w:tcMar>
-            <w:vAlign w:val="center"/>
-          </w:tcPr>
-          <w:p>
-            <w:pPr>
-              <w:jc w:val="left"/>
-            </w:pPr>
-            <w:r>
-              <w:rPr>
-                <w:rFonts w:ascii="Calibri" w:cs="Calibri" w:eastAsia="Calibri" w:hAnsi="Calibri"/>
-                <w:b/>
-                <w:bCs/>
-                <w:color w:val="1C1A3A"/>
-                <w:sz w:val="19"/>
-                <w:szCs w:val="19"/>
-              </w:rPr>
-              <w:t xml:space="preserve">A · Catálogo + WhatsApp</w:t>
-            </w:r>
-          </w:p>
-        </w:tc>
-        <w:tc>
-          <w:tcPr>
-            <w:tcW w:type="dxa" w:w="3100"/>
-            <w:tcBorders>
-              <w:top w:val="single" w:color="D9D3EE" w:sz="4"/>
-              <w:left w:val="single" w:color="D9D3EE" w:sz="4"/>
-              <w:bottom w:val="single" w:color="D9D3EE" w:sz="4"/>
-              <w:right w:val="single" w:color="D9D3EE" w:sz="4"/>
-            </w:tcBorders>
-            <w:tcMar>
-              <w:top w:type="dxa" w:w="70"/>
-              <w:left w:type="dxa" w:w="100"/>
-              <w:bottom w:type="dxa" w:w="70"/>
-              <w:right w:type="dxa" w:w="100"/>
-            </w:tcMar>
-            <w:vAlign w:val="center"/>
-          </w:tcPr>
-          <w:p>
-            <w:pPr>
-              <w:jc w:val="center"/>
-            </w:pPr>
-            <w:r>
-              <w:rPr>
-                <w:rFonts w:ascii="Calibri" w:cs="Calibri" w:eastAsia="Calibri" w:hAnsi="Calibri"/>
-                <w:b/>
-                <w:bCs/>
-                <w:color w:val="1C1A3A"/>
-                <w:sz w:val="19"/>
-                <w:szCs w:val="19"/>
-              </w:rPr>
-              <w:t xml:space="preserve">295 € + 700 € = 995 €</w:t>
-            </w:r>
-          </w:p>
-        </w:tc>
-        <w:tc>
-          <w:tcPr>
-            <w:tcW w:type="dxa" w:w="1500"/>
-            <w:tcBorders>
-              <w:top w:val="single" w:color="D9D3EE" w:sz="4"/>
-              <w:left w:val="single" w:color="D9D3EE" w:sz="4"/>
-              <w:bottom w:val="single" w:color="D9D3EE" w:sz="4"/>
-              <w:right w:val="single" w:color="D9D3EE" w:sz="4"/>
-            </w:tcBorders>
-            <w:tcMar>
-              <w:top w:type="dxa" w:w="70"/>
-              <w:left w:type="dxa" w:w="100"/>
-              <w:bottom w:type="dxa" w:w="70"/>
-              <w:right w:type="dxa" w:w="100"/>
-            </w:tcMar>
-            <w:vAlign w:val="center"/>
-          </w:tcPr>
-          <w:p>
-            <w:pPr>
-              <w:jc w:val="center"/>
-            </w:pPr>
-            <w:r>
-              <w:rPr>
-                <w:rFonts w:ascii="Calibri" w:cs="Calibri" w:eastAsia="Calibri" w:hAnsi="Calibri"/>
-                <w:color w:val="1C1A3A"/>
-                <w:sz w:val="19"/>
-                <w:szCs w:val="19"/>
-              </w:rPr>
-              <w:t xml:space="preserve">40 €/mes</w:t>
-            </w:r>
-          </w:p>
-        </w:tc>
-        <w:tc>
-          <w:tcPr>
-            <w:tcW w:type="dxa" w:w="2238"/>
-            <w:tcBorders>
-              <w:top w:val="single" w:color="D9D3EE" w:sz="4"/>
-              <w:left w:val="single" w:color="D9D3EE" w:sz="4"/>
-              <w:bottom w:val="single" w:color="D9D3EE" w:sz="4"/>
-              <w:right w:val="single" w:color="D9D3EE" w:sz="4"/>
-            </w:tcBorders>
-            <w:tcMar>
-              <w:top w:type="dxa" w:w="70"/>
-              <w:left w:type="dxa" w:w="100"/>
-              <w:bottom w:type="dxa" w:w="70"/>
-              <w:right w:type="dxa" w:w="100"/>
-            </w:tcMar>
-            <w:vAlign w:val="center"/>
-          </w:tcPr>
-          <w:p>
-            <w:pPr>
-              <w:jc w:val="center"/>
-            </w:pPr>
-            <w:r>
-              <w:rPr>
-                <w:rFonts w:ascii="Calibri" w:cs="Calibri" w:eastAsia="Calibri" w:hAnsi="Calibri"/>
-                <w:b/>
-                <w:bCs/>
-                <w:color w:val="6D3AE8"/>
-                <w:sz w:val="19"/>
-                <w:szCs w:val="19"/>
-              </w:rPr>
-              <w:t xml:space="preserve">12 a 18 días hábiles</w:t>
-            </w:r>
-          </w:p>
-        </w:tc>
-      </w:tr>
-      <w:tr>
-        <w:trPr>
-          <w:cantSplit/>
-        </w:trPr>
-        <w:tc>
-          <w:tcPr>
-            <w:tcW w:type="dxa" w:w="2800"/>
-            <w:tcBorders>
-              <w:top w:val="single" w:color="D9D3EE" w:sz="4"/>
-              <w:left w:val="single" w:color="D9D3EE" w:sz="4"/>
-              <w:bottom w:val="single" w:color="D9D3EE" w:sz="4"/>
-              <w:right w:val="single" w:color="D9D3EE" w:sz="4"/>
-            </w:tcBorders>
-            <w:tcMar>
-              <w:top w:type="dxa" w:w="70"/>
-              <w:left w:type="dxa" w:w="100"/>
-              <w:bottom w:type="dxa" w:w="70"/>
-              <w:right w:type="dxa" w:w="100"/>
-            </w:tcMar>
-            <w:vAlign w:val="center"/>
-          </w:tcPr>
-          <w:p>
-            <w:pPr>
-              <w:jc w:val="left"/>
-            </w:pPr>
-            <w:r>
-              <w:rPr>
-                <w:rFonts w:ascii="Calibri" w:cs="Calibri" w:eastAsia="Calibri" w:hAnsi="Calibri"/>
-                <w:b/>
-                <w:bCs/>
-                <w:color w:val="1C1A3A"/>
-                <w:sz w:val="19"/>
-                <w:szCs w:val="19"/>
-              </w:rPr>
-              <w:t xml:space="preserve">C · Tienda online propia</w:t>
-            </w:r>
-          </w:p>
-        </w:tc>
-        <w:tc>
-          <w:tcPr>
-            <w:tcW w:type="dxa" w:w="3100"/>
-            <w:tcBorders>
-              <w:top w:val="single" w:color="D9D3EE" w:sz="4"/>
-              <w:left w:val="single" w:color="D9D3EE" w:sz="4"/>
-              <w:bottom w:val="single" w:color="D9D3EE" w:sz="4"/>
-              <w:right w:val="single" w:color="D9D3EE" w:sz="4"/>
-            </w:tcBorders>
-            <w:tcMar>
-              <w:top w:type="dxa" w:w="70"/>
-              <w:left w:type="dxa" w:w="100"/>
-              <w:bottom w:type="dxa" w:w="70"/>
-              <w:right w:type="dxa" w:w="100"/>
-            </w:tcMar>
-            <w:vAlign w:val="center"/>
-          </w:tcPr>
-          <w:p>
-            <w:pPr>
-              <w:jc w:val="center"/>
-            </w:pPr>
-            <w:r>
-              <w:rPr>
-                <w:rFonts w:ascii="Calibri" w:cs="Calibri" w:eastAsia="Calibri" w:hAnsi="Calibri"/>
-                <w:b/>
-                <w:bCs/>
-                <w:color w:val="1C1A3A"/>
-                <w:sz w:val="19"/>
-                <w:szCs w:val="19"/>
-              </w:rPr>
-              <w:t xml:space="preserve">790 € + 700 € = 1.490 €</w:t>
-            </w:r>
-          </w:p>
-        </w:tc>
-        <w:tc>
-          <w:tcPr>
-            <w:tcW w:type="dxa" w:w="1500"/>
-            <w:tcBorders>
-              <w:top w:val="single" w:color="D9D3EE" w:sz="4"/>
-              <w:left w:val="single" w:color="D9D3EE" w:sz="4"/>
-              <w:bottom w:val="single" w:color="D9D3EE" w:sz="4"/>
-              <w:right w:val="single" w:color="D9D3EE" w:sz="4"/>
-            </w:tcBorders>
-            <w:tcMar>
-              <w:top w:type="dxa" w:w="70"/>
-              <w:left w:type="dxa" w:w="100"/>
-              <w:bottom w:type="dxa" w:w="70"/>
-              <w:right w:type="dxa" w:w="100"/>
-            </w:tcMar>
-            <w:vAlign w:val="center"/>
-          </w:tcPr>
-          <w:p>
-            <w:pPr>
-              <w:jc w:val="center"/>
-            </w:pPr>
-            <w:r>
-              <w:rPr>
-                <w:rFonts w:ascii="Calibri" w:cs="Calibri" w:eastAsia="Calibri" w:hAnsi="Calibri"/>
-                <w:color w:val="1C1A3A"/>
-                <w:sz w:val="19"/>
-                <w:szCs w:val="19"/>
-              </w:rPr>
-              <w:t xml:space="preserve">55 €/mes</w:t>
-            </w:r>
-          </w:p>
-        </w:tc>
-        <w:tc>
-          <w:tcPr>
-            <w:tcW w:type="dxa" w:w="2238"/>
-            <w:tcBorders>
-              <w:top w:val="single" w:color="D9D3EE" w:sz="4"/>
-              <w:left w:val="single" w:color="D9D3EE" w:sz="4"/>
-              <w:bottom w:val="single" w:color="D9D3EE" w:sz="4"/>
-              <w:right w:val="single" w:color="D9D3EE" w:sz="4"/>
-            </w:tcBorders>
-            <w:tcMar>
-              <w:top w:type="dxa" w:w="70"/>
-              <w:left w:type="dxa" w:w="100"/>
-              <w:bottom w:type="dxa" w:w="70"/>
-              <w:right w:type="dxa" w:w="100"/>
-            </w:tcMar>
-            <w:vAlign w:val="center"/>
-          </w:tcPr>
-          <w:p>
-            <w:pPr>
-              <w:jc w:val="center"/>
-            </w:pPr>
-            <w:r>
-              <w:rPr>
-                <w:rFonts w:ascii="Calibri" w:cs="Calibri" w:eastAsia="Calibri" w:hAnsi="Calibri"/>
-                <w:b/>
-                <w:bCs/>
-                <w:color w:val="6D3AE8"/>
-                <w:sz w:val="19"/>
-                <w:szCs w:val="19"/>
-              </w:rPr>
-              <w:t xml:space="preserve">25 a 35 días hábiles</w:t>
-            </w:r>
-          </w:p>
-        </w:tc>
-      </w:tr>
-      <w:tr>
-        <w:trPr>
-          <w:cantSplit/>
-        </w:trPr>
-        <w:tc>
-          <w:tcPr>
-            <w:tcW w:type="dxa" w:w="2800"/>
-            <w:tcBorders>
-              <w:top w:val="single" w:color="D9D3EE" w:sz="4"/>
-              <w:left w:val="single" w:color="D9D3EE" w:sz="4"/>
-              <w:bottom w:val="single" w:color="D9D3EE" w:sz="4"/>
-              <w:right w:val="single" w:color="D9D3EE" w:sz="4"/>
-            </w:tcBorders>
-            <w:tcMar>
-              <w:top w:type="dxa" w:w="70"/>
-              <w:left w:type="dxa" w:w="100"/>
-              <w:bottom w:type="dxa" w:w="70"/>
-              <w:right w:type="dxa" w:w="100"/>
-            </w:tcMar>
-            <w:vAlign w:val="center"/>
-          </w:tcPr>
-          <w:p>
-            <w:pPr>
-              <w:jc w:val="left"/>
-            </w:pPr>
-            <w:r>
-              <w:rPr>
-                <w:rFonts w:ascii="Calibri" w:cs="Calibri" w:eastAsia="Calibri" w:hAnsi="Calibri"/>
-                <w:b/>
-                <w:bCs/>
-                <w:color w:val="1C1A3A"/>
-                <w:sz w:val="19"/>
-                <w:szCs w:val="19"/>
-              </w:rPr>
-              <w:t xml:space="preserve">D · Tienda + proveedor</w:t>
-            </w:r>
-          </w:p>
-        </w:tc>
-        <w:tc>
-          <w:tcPr>
-            <w:tcW w:type="dxa" w:w="3100"/>
-            <w:tcBorders>
-              <w:top w:val="single" w:color="D9D3EE" w:sz="4"/>
-              <w:left w:val="single" w:color="D9D3EE" w:sz="4"/>
-              <w:bottom w:val="single" w:color="D9D3EE" w:sz="4"/>
-              <w:right w:val="single" w:color="D9D3EE" w:sz="4"/>
-            </w:tcBorders>
-            <w:tcMar>
-              <w:top w:type="dxa" w:w="70"/>
-              <w:left w:type="dxa" w:w="100"/>
-              <w:bottom w:type="dxa" w:w="70"/>
-              <w:right w:type="dxa" w:w="100"/>
-            </w:tcMar>
-            <w:vAlign w:val="center"/>
-          </w:tcPr>
-          <w:p>
-            <w:pPr>
-              <w:jc w:val="center"/>
-            </w:pPr>
-            <w:r>
-              <w:rPr>
-                <w:rFonts w:ascii="Calibri" w:cs="Calibri" w:eastAsia="Calibri" w:hAnsi="Calibri"/>
-                <w:b/>
-                <w:bCs/>
-                <w:color w:val="1C1A3A"/>
-                <w:sz w:val="19"/>
-                <w:szCs w:val="19"/>
-              </w:rPr>
-              <w:t xml:space="preserve">1.180 € + 700 € = 1.880 €</w:t>
-            </w:r>
-          </w:p>
-        </w:tc>
-        <w:tc>
-          <w:tcPr>
-            <w:tcW w:type="dxa" w:w="1500"/>
-            <w:tcBorders>
-              <w:top w:val="single" w:color="D9D3EE" w:sz="4"/>
-              <w:left w:val="single" w:color="D9D3EE" w:sz="4"/>
-              <w:bottom w:val="single" w:color="D9D3EE" w:sz="4"/>
-              <w:right w:val="single" w:color="D9D3EE" w:sz="4"/>
-            </w:tcBorders>
-            <w:tcMar>
-              <w:top w:type="dxa" w:w="70"/>
-              <w:left w:type="dxa" w:w="100"/>
-              <w:bottom w:type="dxa" w:w="70"/>
-              <w:right w:type="dxa" w:w="100"/>
-            </w:tcMar>
-            <w:vAlign w:val="center"/>
-          </w:tcPr>
-          <w:p>
-            <w:pPr>
-              <w:jc w:val="center"/>
-            </w:pPr>
-            <w:r>
-              <w:rPr>
-                <w:rFonts w:ascii="Calibri" w:cs="Calibri" w:eastAsia="Calibri" w:hAnsi="Calibri"/>
-                <w:color w:val="1C1A3A"/>
-                <w:sz w:val="19"/>
-                <w:szCs w:val="19"/>
-              </w:rPr>
-              <w:t xml:space="preserve">70 €/mes</w:t>
-            </w:r>
-          </w:p>
-        </w:tc>
-        <w:tc>
-          <w:tcPr>
-            <w:tcW w:type="dxa" w:w="2238"/>
-            <w:tcBorders>
-              <w:top w:val="single" w:color="D9D3EE" w:sz="4"/>
-              <w:left w:val="single" w:color="D9D3EE" w:sz="4"/>
-              <w:bottom w:val="single" w:color="D9D3EE" w:sz="4"/>
-              <w:right w:val="single" w:color="D9D3EE" w:sz="4"/>
-            </w:tcBorders>
-            <w:tcMar>
-              <w:top w:type="dxa" w:w="70"/>
-              <w:left w:type="dxa" w:w="100"/>
-              <w:bottom w:type="dxa" w:w="70"/>
-              <w:right w:type="dxa" w:w="100"/>
-            </w:tcMar>
-            <w:vAlign w:val="center"/>
-          </w:tcPr>
-          <w:p>
-            <w:pPr>
-              <w:jc w:val="center"/>
-            </w:pPr>
-            <w:r>
-              <w:rPr>
-                <w:rFonts w:ascii="Calibri" w:cs="Calibri" w:eastAsia="Calibri" w:hAnsi="Calibri"/>
-                <w:b/>
-                <w:bCs/>
-                <w:color w:val="6D3AE8"/>
-                <w:sz w:val="19"/>
-                <w:szCs w:val="19"/>
-              </w:rPr>
-              <w:t xml:space="preserve">30 a 40 días hábiles</w:t>
+              <w:t xml:space="preserve">30 a 40 días hábiles***</w:t>
             </w:r>
           </w:p>
         </w:tc>
@@ -4244,7 +3678,7 @@
           <w:sz w:val="21"/>
           <w:szCs w:val="21"/>
         </w:rPr>
-        <w:t xml:space="preserve">Importes sin IVA. El paquete B (botón de pago en 15 productos) no encaja con 1.200: para cobrar online con todo el catálogo, elige la tienda (C o D).</w:t>
+        <w:t xml:space="preserve">Importes sin IVA. Cada proveedor adicional: +250 € de alta y +10 €/mes, si entrega su catálogo en Excel, CSV o feed. La carga de catálogo es +250 € hasta 300 productos y +700 € hasta 1.200 (en D la carga incluye tus 230 piezas y el catálogo del proveedor). Para vender los modelos del proveedor es necesaria la opción D.</w:t>
       </w:r>
     </w:p>
     <w:p>
@@ -4280,7 +3714,7 @@
           <w:sz w:val="21"/>
           <w:szCs w:val="21"/>
         </w:rPr>
-        <w:t xml:space="preserve">Carga masiva desde tu hoja de cálculo (no se escribe producto a producto).</w:t>
+        <w:t xml:space="preserve">Tus 230 piezas aparecen como «En el puesto» (recogida hoy o envío en 24 a 48 h) y los modelos del proveedor como «Del proveedor» (lo envía él directamente a tu cliente).</w:t>
       </w:r>
     </w:p>
     <w:p>
@@ -4299,7 +3733,7 @@
           <w:sz w:val="21"/>
           <w:szCs w:val="21"/>
         </w:rPr>
-        <w:t xml:space="preserve">Buscador por nombre, color o referencia, y filtros por categoría.</w:t>
+        <w:t xml:space="preserve">Buscador por nombre, color o referencia, filtros por categoría y por origen.</w:t>
       </w:r>
     </w:p>
     <w:p>
@@ -4318,7 +3752,7 @@
           <w:sz w:val="21"/>
           <w:szCs w:val="21"/>
         </w:rPr>
-        <w:t xml:space="preserve">«Mi pedido»: tus clientes añaden varios productos y te los mandan en un solo mensaje de WhatsApp, con el total estimado.</w:t>
+        <w:t xml:space="preserve">«Mi pedido»: tus clientes añaden varios productos y te los mandan en un solo mensaje de WhatsApp.</w:t>
       </w:r>
     </w:p>
     <w:p>
@@ -4337,7 +3771,7 @@
           <w:sz w:val="21"/>
           <w:szCs w:val="21"/>
         </w:rPr>
-        <w:t xml:space="preserve">Precios por menor y por mayor, con las unidades mínimas de cada producto.</w:t>
+        <w:t xml:space="preserve">Precios por menor y por mayor, con las unidades mínimas.</w:t>
       </w:r>
     </w:p>
     <w:p>
@@ -4356,7 +3790,7 @@
           <w:sz w:val="21"/>
           <w:szCs w:val="21"/>
         </w:rPr>
-        <w:t xml:space="preserve">Fotos optimizadas para que la web cargue rápido en el móvil.</w:t>
+        <w:t xml:space="preserve">Aviso claro al cliente cuando su pedido llega en dos envíos.</w:t>
       </w:r>
     </w:p>
     <w:p>
@@ -4375,7 +3809,7 @@
           <w:sz w:val="21"/>
           <w:szCs w:val="21"/>
         </w:rPr>
-        <w:t xml:space="preserve">Salida por tandas: publicamos con tus 150 a 200 productos más vendidos y subimos el resto durante las dos semanas siguientes.</w:t>
+        <w:t xml:space="preserve">Salida por tandas: publicamos con tus 230 piezas y los modelos más vendidos del proveedor, y subimos el resto en las semanas siguientes.</w:t>
       </w:r>
     </w:p>
     <w:p>
@@ -4411,7 +3845,7 @@
           <w:sz w:val="21"/>
           <w:szCs w:val="21"/>
         </w:rPr>
-        <w:t xml:space="preserve">Una hoja de cálculo (Excel) con una fila por producto y estas columnas: referencia, nombre, categoría, medidas o variantes, colores, precio por menor, precio por mayor, unidades mínimas por mayor y nombre del archivo de la foto.</w:t>
+        <w:t xml:space="preserve">Tus 230 piezas en una hoja de cálculo (referencia, nombre, categoría, medidas, colores, precio por menor, precio por mayor, unidades mínimas y nombre de la foto) y sus fotos.</w:t>
       </w:r>
     </w:p>
     <w:p>
@@ -4430,7 +3864,24 @@
           <w:sz w:val="21"/>
           <w:szCs w:val="21"/>
         </w:rPr>
-        <w:t xml:space="preserve">Una carpeta con las fotos, con el nombre de archivo de cada producto.</w:t>
+        <w:t xml:space="preserve">Quedamos de acuerdo en cómo actualizas el stock del puesto: así no vendes online lo que ya vendiste en el mercadillo.</w:t>
+      </w:r>
+    </w:p>
+    <w:p>
+      <w:pPr>
+        <w:keepNext/>
+        <w:spacing w:after="40" w:before="100"/>
+      </w:pPr>
+      <w:r>
+        <w:rPr>
+          <w:rFonts w:ascii="Calibri" w:cs="Calibri" w:eastAsia="Calibri" w:hAnsi="Calibri"/>
+          <w:b/>
+          <w:bCs/>
+          <w:color w:val="6D3AE8"/>
+          <w:sz w:val="21"/>
+          <w:szCs w:val="21"/>
+        </w:rPr>
+        <w:t xml:space="preserve">Y de tus proveedores</w:t>
       </w:r>
     </w:p>
     <w:p>
@@ -4449,7 +3900,64 @@
           <w:sz w:val="21"/>
           <w:szCs w:val="21"/>
         </w:rPr>
-        <w:t xml:space="preserve">Si no tienes la hoja, la preparamos nosotros por 1,50 € por producto (1.200 productos: 1.800 €). Lo más rápido es que la mandes tú.</w:t>
+        <w:t xml:space="preserve">Confirmación por escrito de que envía directamente a tu cliente, en tu nombre y sin su factura dentro del paquete.</w:t>
+      </w:r>
+    </w:p>
+    <w:p>
+      <w:pPr>
+        <w:pStyle w:val="ListParagraph"/>
+        <w:numPr>
+          <w:ilvl w:val="0"/>
+          <w:numId w:val="2"/>
+        </w:numPr>
+        <w:spacing w:after="50" w:line="280"/>
+      </w:pPr>
+      <w:r>
+        <w:rPr>
+          <w:rFonts w:ascii="Calibri" w:cs="Calibri" w:eastAsia="Calibri" w:hAnsi="Calibri"/>
+          <w:color w:val="1C1A3A"/>
+          <w:sz w:val="21"/>
+          <w:szCs w:val="21"/>
+        </w:rPr>
+        <w:t xml:space="preserve">Su catálogo completo en Excel, CSV o feed: referencia, nombre, medidas, colores, precio de coste, stock y foto.</w:t>
+      </w:r>
+    </w:p>
+    <w:p>
+      <w:pPr>
+        <w:pStyle w:val="ListParagraph"/>
+        <w:numPr>
+          <w:ilvl w:val="0"/>
+          <w:numId w:val="2"/>
+        </w:numPr>
+        <w:spacing w:after="50" w:line="280"/>
+      </w:pPr>
+      <w:r>
+        <w:rPr>
+          <w:rFonts w:ascii="Calibri" w:cs="Calibri" w:eastAsia="Calibri" w:hAnsi="Calibri"/>
+          <w:color w:val="1C1A3A"/>
+          <w:sz w:val="21"/>
+          <w:szCs w:val="21"/>
+        </w:rPr>
+        <w:t xml:space="preserve">Plazos de entrega, coste de envío y política de devoluciones.</w:t>
+      </w:r>
+    </w:p>
+    <w:p>
+      <w:pPr>
+        <w:pStyle w:val="ListParagraph"/>
+        <w:numPr>
+          <w:ilvl w:val="0"/>
+          <w:numId w:val="2"/>
+        </w:numPr>
+        <w:spacing w:after="50" w:line="280"/>
+      </w:pPr>
+      <w:r>
+        <w:rPr>
+          <w:rFonts w:ascii="Calibri" w:cs="Calibri" w:eastAsia="Calibri" w:hAnsi="Calibri"/>
+          <w:color w:val="1C1A3A"/>
+          <w:sz w:val="21"/>
+          <w:szCs w:val="21"/>
+        </w:rPr>
+        <w:t xml:space="preserve">Cómo recibe los pedidos (correo, portal o conexión automática) y cada cuánto actualiza precios y stock.</w:t>
       </w:r>
     </w:p>
     <w:p>
@@ -4465,16 +3973,16 @@
           <w:sz w:val="21"/>
           <w:szCs w:val="21"/>
         </w:rPr>
-        <w:t xml:space="preserve">Salida por tandas: </w:t>
-      </w:r>
-      <w:r>
-        <w:rPr>
-          <w:rFonts w:ascii="Calibri" w:cs="Calibri" w:eastAsia="Calibri" w:hAnsi="Calibri"/>
-          <w:color w:val="1C1A3A"/>
-          <w:sz w:val="21"/>
-          <w:szCs w:val="21"/>
-        </w:rPr>
-        <w:t xml:space="preserve">con los 150 a 200 productos más vendidos y la hoja de cálculo del resto en nuestras manos, publicamos en 7 a 10 días hábiles y vamos subiendo el resto en las dos semanas siguientes, sin costes extra.</w:t>
+        <w:t xml:space="preserve">Antes de empezar: </w:t>
+      </w:r>
+      <w:r>
+        <w:rPr>
+          <w:rFonts w:ascii="Calibri" w:cs="Calibri" w:eastAsia="Calibri" w:hAnsi="Calibri"/>
+          <w:color w:val="1C1A3A"/>
+          <w:sz w:val="21"/>
+          <w:szCs w:val="21"/>
+        </w:rPr>
+        <w:t xml:space="preserve">confirmamos con tu proveedor que acepta enviar directamente. Si no acepta, la web puede mostrar sus modelos «bajo pedido» (tú compras y envías tú, con plazo mayor) o dejamos solo los modelos que sí envíen. El negocio sigue siendo el vendedor ante el cliente: las devoluciones y reclamaciones las gestionas tú.</w:t>
       </w:r>
     </w:p>
     <w:p>
@@ -4488,7 +3996,7 @@
           <w:sz w:val="21"/>
           <w:szCs w:val="21"/>
         </w:rPr>
-        <w:t xml:space="preserve">Estos plazos cuentan desde que recibimos la hoja de cálculo completa, las fotos y el primer pago. El camino crítico es tener lista esa información: si llega por tandas, el plazo se alarga.</w:t>
+        <w:t xml:space="preserve">*** Depende de que el proveedor confirme las condiciones y entregue su catálogo. Los plazos cuentan desde que recibimos las hojas de cálculo, las fotos y el primer pago.</w:t>
       </w:r>
     </w:p>
     <w:p>

</xml_diff>